<commit_message>
Remove old files 2
</commit_message>
<xml_diff>
--- a/documentation/EXPERIMENT_REPRODUCTION_GUIDE.docx
+++ b/documentation/EXPERIMENT_REPRODUCTION_GUIDE.docx
@@ -18,12 +18,118 @@
     <w:p>
       <w:pPr>
         <w:bidi/>
-      </w:pPr>
-      <w:r>
-        <w:rPr>
-          <w:rtl/>
-        </w:rPr>
-        <w:t>המדריך מיועד להרצה חוזרת של הניסויים המרכזיים שמופיעים בדו"ח. אם קובצי הביניים כבר קיימים, אין צורך לבצע מחדש את שלבי הורדת הנתונים וחיתוך האודיו.</w:t>
+        <w:rPr>
+          <w:rtl/>
+          <w:lang w:bidi="he-IL"/>
+        </w:rPr>
+      </w:pPr>
+      <w:r>
+        <w:rPr>
+          <w:rtl/>
+        </w:rPr>
+        <w:t xml:space="preserve">המדריך מיועד להרצה חוזרת של הניסויים המרכזיים שמופיעים בדו"ח. אם קובצי הביניים כבר קיימים, אין צורך לבצע מחדש את </w:t>
+      </w:r>
+      <w:r>
+        <w:rPr>
+          <w:rFonts w:hint="cs"/>
+          <w:rtl/>
+          <w:lang w:bidi="he-IL"/>
+        </w:rPr>
+        <w:t xml:space="preserve">השלבים בסעיף 6 , </w:t>
+      </w:r>
+      <w:r>
+        <w:rPr>
+          <w:rFonts w:hint="cs"/>
+          <w:rtl/>
+          <w:lang w:bidi="he-IL"/>
+        </w:rPr>
+        <w:t>במידה ומעוניינים ליצור אותם מחדש</w:t>
+      </w:r>
+      <w:r>
+        <w:rPr>
+          <w:rFonts w:hint="cs"/>
+          <w:rtl/>
+          <w:lang w:bidi="he-IL"/>
+        </w:rPr>
+        <w:t xml:space="preserve"> יש</w:t>
+      </w:r>
+      <w:r>
+        <w:rPr>
+          <w:rFonts w:hint="cs"/>
+          <w:rtl/>
+          <w:lang w:bidi="he-IL"/>
+        </w:rPr>
+        <w:t xml:space="preserve"> לעבור על סעיף 6 וסעיף 10</w:t>
+      </w:r>
+      <w:r>
+        <w:rPr>
+          <w:rtl/>
+        </w:rPr>
+        <w:t>.</w:t>
+      </w:r>
+      <w:r>
+        <w:rPr>
+          <w:rFonts w:hint="cs"/>
+          <w:rtl/>
+          <w:lang w:bidi="he-IL"/>
+        </w:rPr>
+        <w:t xml:space="preserve"> את קבצי ה- </w:t>
+      </w:r>
+      <w:r>
+        <w:rPr>
+          <w:lang w:bidi="he-IL"/>
+        </w:rPr>
+        <w:t>main</w:t>
+      </w:r>
+      <w:r>
+        <w:rPr>
+          <w:rFonts w:hint="cs"/>
+          <w:rtl/>
+          <w:lang w:bidi="he-IL"/>
+        </w:rPr>
+        <w:t xml:space="preserve"> מומלץ להריץ בעזרת  </w:t>
+      </w:r>
+      <w:r>
+        <w:rPr>
+          <w:lang w:bidi="he-IL"/>
+        </w:rPr>
+        <w:t>kaggle</w:t>
+      </w:r>
+      <w:r>
+        <w:rPr>
+          <w:rFonts w:hint="cs"/>
+          <w:rtl/>
+          <w:lang w:bidi="he-IL"/>
+        </w:rPr>
+        <w:t xml:space="preserve"> בעזרת </w:t>
+      </w:r>
+      <w:r>
+        <w:rPr>
+          <w:lang w:bidi="he-IL"/>
+        </w:rPr>
+        <w:t>GPU</w:t>
+      </w:r>
+      <w:r>
+        <w:rPr>
+          <w:rFonts w:hint="cs"/>
+          <w:rtl/>
+          <w:lang w:bidi="he-IL"/>
+        </w:rPr>
+        <w:t xml:space="preserve"> המקצר משמעותית את זמן הריצה ביחס ל </w:t>
+      </w:r>
+      <w:r>
+        <w:rPr>
+          <w:lang w:bidi="he-IL"/>
+        </w:rPr>
+        <w:t>pycharm</w:t>
+      </w:r>
+      <w:r>
+        <w:rPr>
+          <w:rFonts w:hint="cs"/>
+          <w:rtl/>
+          <w:lang w:bidi="he-IL"/>
+        </w:rPr>
+        <w:t xml:space="preserve"> .</w:t>
       </w:r>
     </w:p>
     <w:p>
@@ -89,12 +195,27 @@
       </w:r>
     </w:p>
     <w:p>
+      <w:pPr>
+        <w:rPr>
+          <w:color w:val="000000" w:themeColor="text1"/>
+        </w:rPr>
+      </w:pPr>
+      <w:r>
+        <w:rPr>
+          <w:rFonts w:ascii="Courier New" w:hAnsi="Courier New"/>
+          <w:color w:val="000000" w:themeColor="text1"/>
+          <w:sz w:val="19"/>
+        </w:rPr>
+        <w:t>spectogram_logmel_archive_only</w:t>
+      </w:r>
+    </w:p>
+    <w:p>
       <w:r>
         <w:rPr>
           <w:rFonts w:ascii="Courier New" w:hAnsi="Courier New"/>
           <w:sz w:val="19"/>
         </w:rPr>
-        <w:t>spectogram_logmel_archive_only/</w:t>
+        <w:t>spectogram_logmel_free_text</w:t>
       </w:r>
     </w:p>
     <w:p>
@@ -103,30 +224,247 @@
           <w:rFonts w:ascii="Courier New" w:hAnsi="Courier New"/>
           <w:sz w:val="19"/>
         </w:rPr>
-        <w:t>spectogram_logmel_free_text/</w:t>
+        <w:t>spectogram_logmel_mixed</w:t>
       </w:r>
     </w:p>
     <w:p>
+      <w:pPr>
+        <w:bidi/>
+      </w:pPr>
+      <w:r>
+        <w:rPr>
+          <w:rtl/>
+        </w:rPr>
+        <w:t>ל-Multimodal CNN נדרשים גם הספקטרוגרמות וגם קובץ הפיצ'רים המתאים לאותו מצב.</w:t>
+      </w:r>
+    </w:p>
+    <w:p>
+      <w:pPr>
+        <w:pStyle w:val="Heading2"/>
+        <w:bidi/>
+        <w:rPr>
+          <w:rtl/>
+          <w:lang w:bidi="he-IL"/>
+        </w:rPr>
+      </w:pPr>
+      <w:r>
+        <w:rPr>
+          <w:rFonts w:ascii="Arial" w:hAnsi="Arial"/>
+          <w:rtl/>
+        </w:rPr>
+        <w:t>2. שחזור ניסויי למידת מכונה</w:t>
+      </w:r>
+    </w:p>
+    <w:p>
+      <w:pPr>
+        <w:bidi/>
+      </w:pPr>
+      <w:r>
+        <w:rPr>
+          <w:rtl/>
+        </w:rPr>
+        <w:t>ההרצה מתבצעת דרך:</w:t>
+      </w:r>
+    </w:p>
+    <w:p>
       <w:r>
         <w:rPr>
           <w:rFonts w:ascii="Courier New" w:hAnsi="Courier New"/>
           <w:sz w:val="19"/>
         </w:rPr>
-        <w:t>spectogram_logmel_mixed/</w:t>
+        <w:t>main_for_machine_learning.py</w:t>
       </w:r>
     </w:p>
     <w:p>
       <w:pPr>
         <w:bidi/>
-      </w:pPr>
-      <w:r>
-        <w:rPr>
-          <w:rtl/>
-        </w:rPr>
-        <w:t>ל-Multimodal CNN נדרשים גם הספקטרוגרמות וגם קובץ הפיצ'רים המתאים לאותו מצב.</w:t>
+        <w:rPr>
+          <w:rtl/>
+          <w:lang w:bidi="he-IL"/>
+        </w:rPr>
+      </w:pPr>
+      <w:r>
+        <w:rPr>
+          <w:rFonts w:hint="cs"/>
+          <w:rtl/>
+          <w:lang w:bidi="he-IL"/>
+        </w:rPr>
+        <w:t xml:space="preserve">או דרך מחברת </w:t>
+      </w:r>
+      <w:r>
+        <w:rPr>
+          <w:lang w:bidi="he-IL"/>
+        </w:rPr>
+        <w:t>kaggle</w:t>
+      </w:r>
+      <w:r>
+        <w:rPr>
+          <w:rFonts w:hint="cs"/>
+          <w:rtl/>
+          <w:lang w:bidi="he-IL"/>
+        </w:rPr>
+        <w:t xml:space="preserve"> בקישור הבא :</w:t>
+      </w:r>
+      <w:r>
+        <w:rPr>
+          <w:rtl/>
+          <w:lang w:bidi="he-IL"/>
+        </w:rPr>
+        <w:br/>
       </w:r>
     </w:p>
     <w:p>
+      <w:r>
+        <w:rPr>
+          <w:rFonts w:ascii="Courier New" w:hAnsi="Courier New"/>
+          <w:sz w:val="19"/>
+        </w:rPr>
+        <w:t>[להוסיף קישור]</w:t>
+      </w:r>
+    </w:p>
+    <w:p>
+      <w:pPr>
+        <w:bidi/>
+      </w:pPr>
+      <w:r>
+        <w:rPr>
+          <w:rFonts w:hint="cs"/>
+          <w:rtl/>
+          <w:lang w:bidi="he-IL"/>
+        </w:rPr>
+        <w:t xml:space="preserve">בתוך הקוד </w:t>
+      </w:r>
+      <w:r>
+        <w:rPr>
+          <w:rtl/>
+        </w:rPr>
+        <w:t>יש לבחור את מצב הנתונים:</w:t>
+      </w:r>
+    </w:p>
+    <w:p>
+      <w:r>
+        <w:rPr>
+          <w:rFonts w:ascii="Courier New" w:hAnsi="Courier New"/>
+          <w:sz w:val="19"/>
+        </w:rPr>
+        <w:t>RUN_MODE = "free_text"</w:t>
+      </w:r>
+    </w:p>
+    <w:p>
+      <w:pPr>
+        <w:bidi/>
+      </w:pPr>
+      <w:r>
+        <w:rPr>
+          <w:rtl/>
+        </w:rPr>
+        <w:t>בחירת הפיצ'רים</w:t>
+      </w:r>
+      <w:r>
+        <w:rPr>
+          <w:rFonts w:hint="cs"/>
+          <w:rtl/>
+          <w:lang w:bidi="he-IL"/>
+        </w:rPr>
+        <w:t xml:space="preserve"> המובילים ומס' הפיצרים</w:t>
+      </w:r>
+      <w:r>
+        <w:rPr>
+          <w:rtl/>
+        </w:rPr>
+        <w:t xml:space="preserve"> נשלט</w:t>
+      </w:r>
+      <w:r>
+        <w:rPr>
+          <w:rFonts w:hint="cs"/>
+          <w:rtl/>
+          <w:lang w:bidi="he-IL"/>
+        </w:rPr>
+        <w:t>ים</w:t>
+      </w:r>
+      <w:r>
+        <w:rPr>
+          <w:rtl/>
+        </w:rPr>
+        <w:t xml:space="preserve"> באמצעות:</w:t>
+      </w:r>
+    </w:p>
+    <w:p>
+      <w:r>
+        <w:rPr>
+          <w:rFonts w:ascii="Courier New" w:hAnsi="Courier New"/>
+          <w:sz w:val="19"/>
+        </w:rPr>
+        <w:t>ENABLE_FEATURE_SELECTION = False</w:t>
+      </w:r>
+    </w:p>
+    <w:p>
+      <w:r>
+        <w:rPr>
+          <w:rFonts w:ascii="Courier New" w:hAnsi="Courier New"/>
+          <w:sz w:val="19"/>
+        </w:rPr>
+        <w:t>TOP_K_FEATURES = 30</w:t>
+      </w:r>
+    </w:p>
+    <w:p>
+      <w:pPr>
+        <w:bidi/>
+      </w:pPr>
+      <w:r>
+        <w:rPr>
+          <w:rtl/>
+        </w:rPr>
+        <w:t>ומצב כוונון</w:t>
+      </w:r>
+      <w:r>
+        <w:rPr>
+          <w:rFonts w:hint="cs"/>
+          <w:rtl/>
+          <w:lang w:bidi="he-IL"/>
+        </w:rPr>
+        <w:t xml:space="preserve"> ההיפר-פרמטרים מופעל</w:t>
+      </w:r>
+      <w:r>
+        <w:rPr>
+          <w:rtl/>
+        </w:rPr>
+        <w:t xml:space="preserve"> באמצעות:</w:t>
+      </w:r>
+    </w:p>
+    <w:p>
+      <w:r>
+        <w:rPr>
+          <w:rFonts w:ascii="Courier New" w:hAnsi="Courier New"/>
+          <w:sz w:val="19"/>
+        </w:rPr>
+        <w:t>TUNING_MODE = "random_search"</w:t>
+      </w:r>
+    </w:p>
+    <w:p>
+      <w:pPr>
+        <w:bidi/>
+        <w:rPr>
+          <w:rtl/>
+          <w:lang w:bidi="he-IL"/>
+        </w:rPr>
+      </w:pPr>
+      <w:r>
+        <w:rPr>
+          <w:rtl/>
+        </w:rPr>
+        <w:t>יש להשתמש בערכים המתאימים לניסוי המתואר בדו"ח.</w:t>
+      </w:r>
+    </w:p>
+    <w:p>
+      <w:pPr>
+        <w:bidi/>
+        <w:rPr>
+          <w:lang w:bidi="he-IL"/>
+        </w:rPr>
+      </w:pPr>
+    </w:p>
+    <w:p>
       <w:pPr>
         <w:pStyle w:val="Heading2"/>
         <w:bidi/>
@@ -136,7 +474,8 @@
           <w:rFonts w:ascii="Arial" w:hAnsi="Arial"/>
           <w:rtl/>
         </w:rPr>
-        <w:t>2. שחזור ניסויי למידת מכונה</w:t>
+        <w:lastRenderedPageBreak/>
+        <w:t>3. שחזור המודל האקוסטי</w:t>
       </w:r>
     </w:p>
     <w:p>
@@ -147,7 +486,7 @@
         <w:rPr>
           <w:rtl/>
         </w:rPr>
-        <w:t>ההרצה מתבצעת דרך:</w:t>
+        <w:t>יש לוודא שקיימת תיקיית הספקטרוגרמות המתאימה למצב ההרצה.</w:t>
       </w:r>
     </w:p>
     <w:p>
@@ -156,7 +495,7 @@
           <w:rFonts w:ascii="Courier New" w:hAnsi="Courier New"/>
           <w:sz w:val="19"/>
         </w:rPr>
-        <w:t>main_for_machine_learning.py</w:t>
+        <w:t>spectogram_logmel_&lt;mode&gt;/</w:t>
       </w:r>
     </w:p>
     <w:p>
@@ -167,7 +506,7 @@
         <w:rPr>
           <w:rtl/>
         </w:rPr>
-        <w:t>יש לבחור את מצב הנתונים:</w:t>
+        <w:t>לאחר מכן מריצים:</w:t>
       </w:r>
     </w:p>
     <w:p>
@@ -176,18 +515,22 @@
           <w:rFonts w:ascii="Courier New" w:hAnsi="Courier New"/>
           <w:sz w:val="19"/>
         </w:rPr>
-        <w:t>RUN_MODE = "free_text"</w:t>
+        <w:t>main_cnn.py</w:t>
       </w:r>
     </w:p>
     <w:p>
       <w:pPr>
         <w:bidi/>
-      </w:pPr>
-      <w:r>
-        <w:rPr>
-          <w:rtl/>
-        </w:rPr>
-        <w:t>בחירת הפיצ'רים נשלטת באמצעות:</w:t>
+        <w:rPr>
+          <w:rtl/>
+          <w:lang w:bidi="he-IL"/>
+        </w:rPr>
+      </w:pPr>
+      <w:r>
+        <w:rPr>
+          <w:rtl/>
+        </w:rPr>
+        <w:t>מחברת Kaggle:</w:t>
       </w:r>
     </w:p>
     <w:p>
@@ -196,16 +539,55 @@
           <w:rFonts w:ascii="Courier New" w:hAnsi="Courier New"/>
           <w:sz w:val="19"/>
         </w:rPr>
-        <w:t>ENABLE_FEATURE_SELECTION = False</w:t>
+        <w:t>[להוסיף קישור]</w:t>
       </w:r>
     </w:p>
     <w:p>
+      <w:pPr>
+        <w:pStyle w:val="Heading2"/>
+        <w:bidi/>
+      </w:pPr>
+      <w:r>
+        <w:rPr>
+          <w:rFonts w:ascii="Arial" w:hAnsi="Arial"/>
+          <w:rtl/>
+        </w:rPr>
+        <w:t>4. שחזור המודל המולטי-מודאלי</w:t>
+      </w:r>
+    </w:p>
+    <w:p>
+      <w:pPr>
+        <w:bidi/>
+      </w:pPr>
+      <w:r>
+        <w:rPr>
+          <w:rtl/>
+        </w:rPr>
+        <w:t>יש לוודא שקיימים גם הספקטרוגרמות וגם קובץ הפיצ'רים של אותו מצב.</w:t>
+      </w:r>
+    </w:p>
+    <w:p>
+      <w:pPr>
+        <w:bidi/>
+        <w:rPr>
+          <w:rtl/>
+          <w:lang w:bidi="he-IL"/>
+        </w:rPr>
+      </w:pPr>
+      <w:r>
+        <w:rPr>
+          <w:rtl/>
+        </w:rPr>
+        <w:t>מריצים:</w:t>
+      </w:r>
+    </w:p>
+    <w:p>
       <w:r>
         <w:rPr>
           <w:rFonts w:ascii="Courier New" w:hAnsi="Courier New"/>
           <w:sz w:val="19"/>
         </w:rPr>
-        <w:t>TOP_K_FEATURES = 30</w:t>
+        <w:t>main_multimodal_cnn.py</w:t>
       </w:r>
     </w:p>
     <w:p>
@@ -216,7 +598,7 @@
         <w:rPr>
           <w:rtl/>
         </w:rPr>
-        <w:t>ומצב הכוונון באמצעות:</w:t>
+        <w:t>מחברת Kaggle:</w:t>
       </w:r>
     </w:p>
     <w:p>
@@ -225,51 +607,276 @@
           <w:rFonts w:ascii="Courier New" w:hAnsi="Courier New"/>
           <w:sz w:val="19"/>
         </w:rPr>
-        <w:t>TUNING_MODE = "random_search"</w:t>
+        <w:t>[להוסיף קישור]</w:t>
       </w:r>
     </w:p>
     <w:p>
       <w:pPr>
+        <w:pStyle w:val="Heading2"/>
         <w:bidi/>
-      </w:pPr>
-      <w:r>
-        <w:rPr>
-          <w:rtl/>
-        </w:rPr>
-        <w:t>יש להשתמש בערכים המתאימים לניסוי המתואר בדו"ח.</w:t>
+        <w:rPr>
+          <w:rFonts w:ascii="Arial" w:hAnsi="Arial"/>
+          <w:rtl/>
+          <w:lang w:bidi="he-IL"/>
+        </w:rPr>
+      </w:pPr>
+      <w:r>
+        <w:rPr>
+          <w:rFonts w:ascii="Arial" w:hAnsi="Arial" w:hint="cs"/>
+          <w:rtl/>
+          <w:lang w:bidi="he-IL"/>
+        </w:rPr>
+        <w:t>5</w:t>
+      </w:r>
+      <w:r>
+        <w:rPr>
+          <w:rFonts w:ascii="Arial" w:hAnsi="Arial"/>
+          <w:rtl/>
+        </w:rPr>
+        <w:t xml:space="preserve">. שחזור </w:t>
+      </w:r>
+      <w:r>
+        <w:rPr>
+          <w:rFonts w:ascii="Arial" w:hAnsi="Arial" w:hint="cs"/>
+          <w:rtl/>
+          <w:lang w:bidi="he-IL"/>
+        </w:rPr>
+        <w:t xml:space="preserve">ניסוי ההשוואה בין הספקטוגרמות על מאגר </w:t>
+      </w:r>
+      <w:r>
+        <w:rPr>
+          <w:rFonts w:asciiTheme="majorBidi" w:hAnsiTheme="majorBidi"/>
+          <w:lang w:bidi="he-IL"/>
+        </w:rPr>
+        <w:t>archive</w:t>
+      </w:r>
+      <w:r>
+        <w:rPr>
+          <w:rFonts w:ascii="Arial" w:hAnsi="Arial" w:hint="cs"/>
+          <w:rtl/>
+          <w:lang w:bidi="he-IL"/>
+        </w:rPr>
+        <w:t xml:space="preserve"> :</w:t>
       </w:r>
     </w:p>
     <w:p>
       <w:pPr>
         <w:bidi/>
-      </w:pPr>
-      <w:r>
-        <w:rPr>
-          <w:rtl/>
-        </w:rPr>
-        <w:t>מחברת Kaggle:</w:t>
+        <w:rPr>
+          <w:rFonts w:hint="cs"/>
+          <w:rtl/>
+          <w:lang w:bidi="he-IL"/>
+        </w:rPr>
+      </w:pPr>
+      <w:r>
+        <w:rPr>
+          <w:rFonts w:hint="cs"/>
+          <w:rtl/>
+          <w:lang w:bidi="he-IL"/>
+        </w:rPr>
+        <w:t xml:space="preserve">כל הקבצים הרלוונטים לקוד זה מצויים תחת תיקיית </w:t>
+      </w:r>
+      <w:r>
+        <w:rPr>
+          <w:rFonts w:ascii="Courier New" w:hAnsi="Courier New"/>
+          <w:sz w:val="19"/>
+        </w:rPr>
+        <w:t>archive_cnn_dataset</w:t>
+      </w:r>
+      <w:r>
+        <w:rPr>
+          <w:rFonts w:ascii="Courier New" w:hAnsi="Courier New"/>
+          <w:sz w:val="19"/>
+        </w:rPr>
+        <w:t>/</w:t>
+      </w:r>
+      <w:r>
+        <w:rPr>
+          <w:rFonts w:hint="cs"/>
+          <w:rtl/>
+          <w:lang w:bidi="he-IL"/>
+        </w:rPr>
+        <w:t xml:space="preserve"> שתחת התיקייה הראשית</w:t>
       </w:r>
     </w:p>
     <w:p>
+      <w:pPr>
+        <w:bidi/>
+        <w:rPr>
+          <w:rtl/>
+          <w:lang w:bidi="he-IL"/>
+        </w:rPr>
+      </w:pPr>
+    </w:p>
+    <w:p>
       <w:r>
         <w:rPr>
           <w:rFonts w:ascii="Courier New" w:hAnsi="Courier New"/>
           <w:sz w:val="19"/>
-        </w:rPr>
-        <w:t>[להוסיף קישור]</w:t>
+          <w:lang w:bidi="he-IL"/>
+        </w:rPr>
+        <w:t>archive</w:t>
+      </w:r>
+      <w:r>
+        <w:rPr>
+          <w:rFonts w:ascii="Courier New" w:hAnsi="Courier New"/>
+          <w:sz w:val="19"/>
+        </w:rPr>
+        <w:t>_cnn.py</w:t>
       </w:r>
     </w:p>
     <w:p>
       <w:pPr>
+        <w:bidi/>
+      </w:pPr>
+      <w:r>
+        <w:rPr>
+          <w:rtl/>
+        </w:rPr>
+        <w:t>מחברת Kaggle:</w:t>
+      </w:r>
+    </w:p>
+    <w:p>
+      <w:r>
+        <w:rPr>
+          <w:rFonts w:ascii="Courier New" w:hAnsi="Courier New"/>
+          <w:sz w:val="19"/>
+        </w:rPr>
+        <w:t>[להוסיף קישור]</w:t>
+      </w:r>
+    </w:p>
+    <w:p>
+      <w:pPr>
+        <w:bidi/>
+        <w:rPr>
+          <w:b/>
+          <w:bCs/>
+          <w:rtl/>
+          <w:lang w:bidi="he-IL"/>
+        </w:rPr>
+      </w:pPr>
+    </w:p>
+    <w:p>
+      <w:pPr>
+        <w:bidi/>
+        <w:rPr>
+          <w:b/>
+          <w:bCs/>
+          <w:rtl/>
+          <w:lang w:bidi="he-IL"/>
+        </w:rPr>
+      </w:pPr>
+      <w:r>
+        <w:rPr>
+          <w:rFonts w:hint="cs"/>
+          <w:b/>
+          <w:bCs/>
+          <w:rtl/>
+          <w:lang w:bidi="he-IL"/>
+        </w:rPr>
+        <w:t xml:space="preserve">מומלץ לעבוד דרך </w:t>
+      </w:r>
+      <w:r>
+        <w:rPr>
+          <w:b/>
+          <w:bCs/>
+          <w:lang w:bidi="he-IL"/>
+        </w:rPr>
+        <w:t>kaggle</w:t>
+      </w:r>
+      <w:r>
+        <w:rPr>
+          <w:rFonts w:hint="cs"/>
+          <w:b/>
+          <w:bCs/>
+          <w:rtl/>
+          <w:lang w:bidi="he-IL"/>
+        </w:rPr>
+        <w:t xml:space="preserve"> תוך בחירה במצב </w:t>
+      </w:r>
+      <w:r>
+        <w:rPr>
+          <w:b/>
+          <w:bCs/>
+          <w:lang w:bidi="he-IL"/>
+        </w:rPr>
+        <w:t xml:space="preserve">GPU </w:t>
+      </w:r>
+      <w:r>
+        <w:rPr>
+          <w:rFonts w:hint="cs"/>
+          <w:b/>
+          <w:bCs/>
+          <w:rtl/>
+          <w:lang w:bidi="he-IL"/>
+        </w:rPr>
+        <w:t xml:space="preserve"> לצורך קבלת התוצאות בזמן סטנדרטי ,כאשר הקבצים הנדרשים להרצה נמצאים כבר במחברת תחת </w:t>
+      </w:r>
+      <w:r>
+        <w:rPr>
+          <w:b/>
+          <w:bCs/>
+          <w:lang w:bidi="he-IL"/>
+        </w:rPr>
+        <w:t>input</w:t>
+      </w:r>
+      <w:r>
+        <w:rPr>
+          <w:rFonts w:hint="cs"/>
+          <w:b/>
+          <w:bCs/>
+          <w:rtl/>
+          <w:lang w:bidi="he-IL"/>
+        </w:rPr>
+        <w:t xml:space="preserve"> . </w:t>
+      </w:r>
+    </w:p>
+    <w:p>
+      <w:pPr>
         <w:pStyle w:val="Heading2"/>
         <w:bidi/>
-      </w:pPr>
+        <w:rPr>
+          <w:rFonts w:hint="cs"/>
+          <w:lang w:bidi="he-IL"/>
+        </w:rPr>
+      </w:pPr>
+      <w:r>
+        <w:rPr>
+          <w:rFonts w:ascii="Arial" w:hAnsi="Arial" w:hint="cs"/>
+          <w:rtl/>
+          <w:lang w:bidi="he-IL"/>
+        </w:rPr>
+        <w:t>6</w:t>
+      </w:r>
       <w:r>
         <w:rPr>
           <w:rFonts w:ascii="Arial" w:hAnsi="Arial"/>
           <w:rtl/>
         </w:rPr>
-        <w:t>3. שחזור המודל האקוסטי</w:t>
+        <w:t>. יצירת קובצי הקלט מחדש</w:t>
+      </w:r>
+      <w:r>
+        <w:rPr>
+          <w:rFonts w:hint="cs"/>
+          <w:rtl/>
+          <w:lang w:bidi="he-IL"/>
+        </w:rPr>
+        <w:t xml:space="preserve"> </w:t>
+      </w:r>
+      <w:r>
+        <w:rPr>
+          <w:rtl/>
+          <w:lang w:bidi="he-IL"/>
+        </w:rPr>
+        <w:t>–</w:t>
+      </w:r>
+      <w:r>
+        <w:rPr>
+          <w:rFonts w:hint="cs"/>
+          <w:rtl/>
+          <w:lang w:bidi="he-IL"/>
+        </w:rPr>
+        <w:t xml:space="preserve"> פירוט נוסף בסעיף 10</w:t>
       </w:r>
     </w:p>
     <w:p>
@@ -280,16 +887,446 @@
         <w:rPr>
           <w:rtl/>
         </w:rPr>
-        <w:t>יש לוודא שקיימת תיקיית הספקטרוגרמות המתאימה למצב ההרצה.</w:t>
+        <w:t>אם רוצים להתחיל מקובצי האודיו:</w:t>
       </w:r>
     </w:p>
     <w:p>
+      <w:pPr>
+        <w:pStyle w:val="ListNumber"/>
+        <w:bidi/>
+      </w:pPr>
+      <w:r>
+        <w:rPr>
+          <w:rtl/>
+        </w:rPr>
+        <w:t xml:space="preserve">מאחדים את מאגרי ה-Free Text </w:t>
+      </w:r>
+      <w:r>
+        <w:rPr>
+          <w:rFonts w:hint="cs"/>
+          <w:rtl/>
+          <w:lang w:bidi="he-IL"/>
+        </w:rPr>
+        <w:t xml:space="preserve">שבתיקיית </w:t>
+      </w:r>
+      <w:r>
+        <w:rPr>
+          <w:lang w:bidi="he-IL"/>
+        </w:rPr>
+        <w:t>all_accents_data</w:t>
+      </w:r>
+      <w:r>
+        <w:rPr>
+          <w:rFonts w:hint="cs"/>
+          <w:rtl/>
+          <w:lang w:bidi="he-IL"/>
+        </w:rPr>
+        <w:t xml:space="preserve"> </w:t>
+      </w:r>
+      <w:r>
+        <w:rPr>
+          <w:rtl/>
+        </w:rPr>
+        <w:t>בעזרת group_sources_to_one_by_accent.py.</w:t>
+      </w:r>
+    </w:p>
+    <w:p>
+      <w:pPr>
+        <w:pStyle w:val="ListNumber"/>
+        <w:bidi/>
+        <w:rPr>
+          <w:lang w:bidi="he-IL"/>
+        </w:rPr>
+      </w:pPr>
+      <w:r>
+        <w:rPr>
+          <w:rtl/>
+        </w:rPr>
+        <w:t xml:space="preserve">חותכים את Speech Accent Archive </w:t>
+      </w:r>
+      <w:r>
+        <w:rPr>
+          <w:rFonts w:hint="cs"/>
+          <w:rtl/>
+          <w:lang w:bidi="he-IL"/>
+        </w:rPr>
+        <w:t xml:space="preserve">למשפטים </w:t>
+      </w:r>
+      <w:r>
+        <w:rPr>
+          <w:rtl/>
+        </w:rPr>
+        <w:t xml:space="preserve">בעזרת </w:t>
+      </w:r>
+      <w:r>
+        <w:rPr>
+          <w:rFonts w:hint="cs"/>
+          <w:rtl/>
+          <w:lang w:bidi="he-IL"/>
+        </w:rPr>
+        <w:t xml:space="preserve">הקובץ </w:t>
+      </w:r>
+      <w:r>
+        <w:rPr>
+          <w:lang w:bidi="he-IL"/>
+        </w:rPr>
+        <w:t>cut_archive_to_sentences</w:t>
+      </w:r>
+      <w:r>
+        <w:rPr>
+          <w:lang w:bidi="he-IL"/>
+        </w:rPr>
+        <w:t>.py</w:t>
+      </w:r>
+      <w:r>
+        <w:rPr>
+          <w:rtl/>
+        </w:rPr>
+        <w:t xml:space="preserve"> שבתיקיית cut_and_normalize</w:t>
+      </w:r>
+      <w:r>
+        <w:rPr>
+          <w:rFonts w:hint="cs"/>
+          <w:rtl/>
+          <w:lang w:bidi="he-IL"/>
+        </w:rPr>
+        <w:t xml:space="preserve"> .</w:t>
+      </w:r>
+    </w:p>
+    <w:p>
+      <w:pPr>
+        <w:pStyle w:val="ListNumber"/>
+        <w:bidi/>
+      </w:pPr>
+      <w:r>
+        <w:rPr>
+          <w:rtl/>
+        </w:rPr>
+        <w:t>יוצרים metadata בעזרת metadata_generator.py.</w:t>
+      </w:r>
+    </w:p>
+    <w:p>
+      <w:pPr>
+        <w:pStyle w:val="ListNumber"/>
+        <w:bidi/>
+        <w:rPr>
+          <w:lang w:bidi="he-IL"/>
+        </w:rPr>
+      </w:pPr>
+      <w:r>
+        <w:rPr>
+          <w:rtl/>
+        </w:rPr>
+        <w:t>מנרמלים את האודיו בעזרת normalize_all_for_2_folders.py</w:t>
+      </w:r>
+      <w:r>
+        <w:rPr>
+          <w:rFonts w:hint="cs"/>
+          <w:rtl/>
+          <w:lang w:bidi="he-IL"/>
+        </w:rPr>
+        <w:t xml:space="preserve"> </w:t>
+      </w:r>
+      <w:r>
+        <w:rPr>
+          <w:rtl/>
+        </w:rPr>
+        <w:t>שבתיקיית cut_and_normalize</w:t>
+      </w:r>
+      <w:r>
+        <w:rPr>
+          <w:rFonts w:hint="cs"/>
+          <w:rtl/>
+          <w:lang w:bidi="he-IL"/>
+        </w:rPr>
+        <w:t xml:space="preserve"> .</w:t>
+      </w:r>
+    </w:p>
+    <w:p>
+      <w:pPr>
+        <w:pStyle w:val="ListNumber"/>
+        <w:bidi/>
+      </w:pPr>
+      <w:r>
+        <w:rPr>
+          <w:rtl/>
+        </w:rPr>
+        <w:t xml:space="preserve">יוצרים את קובצי הפיצ'רים בעזרת </w:t>
+      </w:r>
+      <w:r>
+        <w:rPr>
+          <w:rFonts w:hint="cs"/>
+          <w:rtl/>
+          <w:lang w:bidi="he-IL"/>
+        </w:rPr>
+        <w:t xml:space="preserve">הקובץ </w:t>
+      </w:r>
+      <w:r>
+        <w:rPr>
+          <w:lang w:bidi="he-IL"/>
+        </w:rPr>
+        <w:t>extract_features.py</w:t>
+      </w:r>
+    </w:p>
+    <w:p>
+      <w:pPr>
+        <w:pStyle w:val="ListNumber"/>
+        <w:bidi/>
+      </w:pPr>
+      <w:r>
+        <w:rPr>
+          <w:rtl/>
+        </w:rPr>
+        <w:t>יוצרים את הספקטרוגרמות בעזרת spectogram_creation.py.</w:t>
+      </w:r>
+    </w:p>
+    <w:p>
+      <w:pPr>
+        <w:pStyle w:val="ListNumber"/>
+        <w:numPr>
+          <w:ilvl w:val="0"/>
+          <w:numId w:val="0"/>
+        </w:numPr>
+        <w:bidi/>
+        <w:rPr>
+          <w:rtl/>
+          <w:lang w:bidi="he-IL"/>
+        </w:rPr>
+      </w:pPr>
+    </w:p>
+    <w:p>
+      <w:pPr>
+        <w:pStyle w:val="ListNumber"/>
+        <w:numPr>
+          <w:ilvl w:val="0"/>
+          <w:numId w:val="0"/>
+        </w:numPr>
+        <w:bidi/>
+        <w:rPr>
+          <w:rtl/>
+          <w:lang w:bidi="he-IL"/>
+        </w:rPr>
+      </w:pPr>
+      <w:r>
+        <w:rPr>
+          <w:rFonts w:hint="cs"/>
+          <w:rtl/>
+          <w:lang w:bidi="he-IL"/>
+        </w:rPr>
+        <w:lastRenderedPageBreak/>
+        <w:t xml:space="preserve">לאחר ביצוע כל 6 השלבים , מתקבלים כל הקבצים הנדרשים להרצת קבצי ה </w:t>
+      </w:r>
+      <w:r>
+        <w:rPr>
+          <w:lang w:bidi="he-IL"/>
+        </w:rPr>
+        <w:t>main</w:t>
+      </w:r>
+      <w:r>
+        <w:rPr>
+          <w:rFonts w:hint="cs"/>
+          <w:rtl/>
+          <w:lang w:bidi="he-IL"/>
+        </w:rPr>
+        <w:t xml:space="preserve"> השונים</w:t>
+      </w:r>
+      <w:r>
+        <w:rPr>
+          <w:rFonts w:hint="cs"/>
+          <w:rtl/>
+          <w:lang w:bidi="he-IL"/>
+        </w:rPr>
+        <w:t xml:space="preserve"> ב </w:t>
+      </w:r>
+      <w:r>
+        <w:rPr>
+          <w:lang w:bidi="he-IL"/>
+        </w:rPr>
+        <w:t>pycharm</w:t>
+      </w:r>
+      <w:r>
+        <w:rPr>
+          <w:rFonts w:hint="cs"/>
+          <w:rtl/>
+          <w:lang w:bidi="he-IL"/>
+        </w:rPr>
+        <w:t xml:space="preserve"> . </w:t>
+      </w:r>
+      <w:r>
+        <w:rPr>
+          <w:rtl/>
+          <w:lang w:bidi="he-IL"/>
+        </w:rPr>
+        <w:br/>
+      </w:r>
+      <w:r>
+        <w:rPr>
+          <w:rFonts w:hint="cs"/>
+          <w:rtl/>
+          <w:lang w:bidi="he-IL"/>
+        </w:rPr>
+        <w:t xml:space="preserve">במידה ומעוניינים להעלות את הקבצים </w:t>
+      </w:r>
+      <w:r>
+        <w:rPr>
+          <w:rFonts w:hint="cs"/>
+          <w:rtl/>
+          <w:lang w:bidi="he-IL"/>
+        </w:rPr>
+        <w:t xml:space="preserve">מחדש </w:t>
+      </w:r>
+      <w:r>
+        <w:rPr>
+          <w:rFonts w:hint="cs"/>
+          <w:rtl/>
+          <w:lang w:bidi="he-IL"/>
+        </w:rPr>
+        <w:t>ל</w:t>
+      </w:r>
+      <w:r>
+        <w:rPr>
+          <w:rFonts w:hint="cs"/>
+          <w:rtl/>
+          <w:lang w:bidi="he-IL"/>
+        </w:rPr>
+        <w:t>מחברות הרלוונטיות ב-</w:t>
+      </w:r>
+      <w:r>
+        <w:rPr>
+          <w:rFonts w:hint="cs"/>
+          <w:rtl/>
+          <w:lang w:bidi="he-IL"/>
+        </w:rPr>
+        <w:t xml:space="preserve"> </w:t>
+      </w:r>
+      <w:r>
+        <w:rPr>
+          <w:lang w:bidi="he-IL"/>
+        </w:rPr>
+        <w:t>kaggle</w:t>
+      </w:r>
+      <w:r>
+        <w:rPr>
+          <w:rFonts w:hint="cs"/>
+          <w:rtl/>
+          <w:lang w:bidi="he-IL"/>
+        </w:rPr>
+        <w:t xml:space="preserve"> </w:t>
+      </w:r>
+      <w:r>
+        <w:rPr>
+          <w:rFonts w:hint="cs"/>
+          <w:rtl/>
+          <w:lang w:bidi="he-IL"/>
+        </w:rPr>
+        <w:t xml:space="preserve">, </w:t>
+      </w:r>
+      <w:r>
+        <w:rPr>
+          <w:rFonts w:hint="cs"/>
+          <w:rtl/>
+          <w:lang w:bidi="he-IL"/>
+        </w:rPr>
+        <w:t xml:space="preserve">נא ראו סעיף </w:t>
+      </w:r>
+      <w:r>
+        <w:rPr>
+          <w:rFonts w:hint="cs"/>
+          <w:rtl/>
+          <w:lang w:bidi="he-IL"/>
+        </w:rPr>
+        <w:t>9</w:t>
+      </w:r>
+      <w:r>
+        <w:rPr>
+          <w:rFonts w:hint="cs"/>
+          <w:rtl/>
+          <w:lang w:bidi="he-IL"/>
+        </w:rPr>
+        <w:t xml:space="preserve"> </w:t>
+      </w:r>
+      <w:r>
+        <w:rPr>
+          <w:rFonts w:hint="cs"/>
+          <w:rtl/>
+          <w:lang w:bidi="he-IL"/>
+        </w:rPr>
+        <w:t>בעמוד הבא.</w:t>
+      </w:r>
+    </w:p>
+    <w:p>
+      <w:pPr>
+        <w:pStyle w:val="Heading2"/>
+        <w:bidi/>
+      </w:pPr>
+      <w:r>
+        <w:rPr>
+          <w:rFonts w:ascii="Arial" w:hAnsi="Arial" w:hint="cs"/>
+          <w:rtl/>
+          <w:lang w:bidi="he-IL"/>
+        </w:rPr>
+        <w:t>7</w:t>
+      </w:r>
+      <w:r>
+        <w:rPr>
+          <w:rFonts w:ascii="Arial" w:hAnsi="Arial"/>
+          <w:rtl/>
+        </w:rPr>
+        <w:t>. גרפים ותוצאות</w:t>
+      </w:r>
+    </w:p>
+    <w:p>
+      <w:pPr>
+        <w:bidi/>
+      </w:pPr>
+      <w:r>
+        <w:rPr>
+          <w:rtl/>
+        </w:rPr>
+        <w:t>חלק מהגרפים נוצרים כחלק מהרצת הניסוי.</w:t>
+      </w:r>
+    </w:p>
+    <w:p>
+      <w:pPr>
+        <w:bidi/>
+        <w:rPr>
+          <w:rtl/>
+        </w:rPr>
+      </w:pPr>
+      <w:r>
+        <w:rPr>
+          <w:rtl/>
+        </w:rPr>
+        <w:t>ב-Kaggle הגרפים מוצגים בפלט של תאי המחברת</w:t>
+      </w:r>
+      <w:r>
+        <w:rPr>
+          <w:rFonts w:hint="cs"/>
+          <w:rtl/>
+          <w:lang w:bidi="he-IL"/>
+        </w:rPr>
+        <w:t xml:space="preserve"> ותחת תיקיית </w:t>
+      </w:r>
+      <w:r>
+        <w:rPr>
+          <w:lang w:bidi="he-IL"/>
+        </w:rPr>
+        <w:t>output</w:t>
+      </w:r>
+      <w:r>
+        <w:rPr>
+          <w:rtl/>
+        </w:rPr>
+        <w:t>. בהרצה מקומית דרך PyCharm הם נשמרים גם בתיקייה:</w:t>
+      </w:r>
+    </w:p>
+    <w:p>
       <w:r>
         <w:rPr>
           <w:rFonts w:ascii="Courier New" w:hAnsi="Courier New"/>
           <w:sz w:val="19"/>
         </w:rPr>
-        <w:t>spectogram_logmel_&lt;mode&gt;/</w:t>
+        <w:t>graphs/</w:t>
       </w:r>
     </w:p>
     <w:p>
@@ -300,47 +1337,954 @@
         <w:rPr>
           <w:rtl/>
         </w:rPr>
-        <w:lastRenderedPageBreak/>
-        <w:t>לאחר מכן מריצים:</w:t>
+        <w:t>לכן בשחזור דרך Kaggle יש לבדוק את פלט התאים, ובהרצה מקומית יש לבדוק גם את תיקיית הגרפים.</w:t>
       </w:r>
     </w:p>
     <w:p>
+      <w:pPr>
+        <w:bidi/>
+      </w:pPr>
+      <w:r>
+        <w:rPr>
+          <w:rtl/>
+        </w:rPr>
+        <w:t xml:space="preserve">תוצאות נוספות </w:t>
+      </w:r>
+      <w:r>
+        <w:rPr>
+          <w:rFonts w:hint="cs"/>
+          <w:rtl/>
+          <w:lang w:bidi="he-IL"/>
+        </w:rPr>
+        <w:t>ששימשו לצורך בדיקות המאגרים ואיכות הפיצול לקבוצות נמצאות תחת תיקיית התוצאות</w:t>
+      </w:r>
+      <w:r>
+        <w:rPr>
+          <w:rtl/>
+        </w:rPr>
+        <w:t>:</w:t>
+      </w:r>
+    </w:p>
+    <w:p>
       <w:r>
         <w:rPr>
           <w:rFonts w:ascii="Courier New" w:hAnsi="Courier New"/>
           <w:sz w:val="19"/>
         </w:rPr>
-        <w:t xml:space="preserve">python </w:t>
-      </w:r>
+        <w:t>results/</w:t>
+      </w:r>
+    </w:p>
+    <w:p>
+      <w:pPr>
+        <w:pStyle w:val="Heading2"/>
+        <w:bidi/>
+      </w:pPr>
+      <w:r>
+        <w:rPr>
+          <w:rFonts w:ascii="Arial" w:hAnsi="Arial" w:hint="cs"/>
+          <w:rtl/>
+          <w:lang w:bidi="he-IL"/>
+        </w:rPr>
+        <w:t>8</w:t>
+      </w:r>
+      <w:r>
+        <w:rPr>
+          <w:rFonts w:ascii="Arial" w:hAnsi="Arial"/>
+          <w:rtl/>
+        </w:rPr>
+        <w:t>. בדיקות לפני השוואה לדו"ח</w:t>
+      </w:r>
+    </w:p>
+    <w:p>
+      <w:pPr>
+        <w:bidi/>
+      </w:pPr>
+      <w:r>
+        <w:rPr>
+          <w:rtl/>
+        </w:rPr>
+        <w:t>לפני ההרצה יש לוודא שמשתמשים באותו מצב נתונים ובאותן הגדרות של הניסוי המקורי, ובפרט:</w:t>
+      </w:r>
+    </w:p>
+    <w:p>
+      <w:pPr>
+        <w:pStyle w:val="ListBullet"/>
+        <w:bidi/>
+      </w:pPr>
+      <w:r>
+        <w:rPr>
+          <w:rtl/>
+        </w:rPr>
+        <w:t>מצב הנתונים.</w:t>
+      </w:r>
+    </w:p>
+    <w:p>
+      <w:pPr>
+        <w:pStyle w:val="ListBullet"/>
+        <w:bidi/>
+      </w:pPr>
+      <w:r>
+        <w:rPr>
+          <w:rtl/>
+        </w:rPr>
+        <w:t>הפעלת או ביטול Feature Selection.</w:t>
+      </w:r>
+    </w:p>
+    <w:p>
+      <w:pPr>
+        <w:pStyle w:val="ListBullet"/>
+        <w:bidi/>
+      </w:pPr>
+      <w:r>
+        <w:rPr>
+          <w:rtl/>
+        </w:rPr>
+        <w:t>מספר הפיצ'רים כאשר הבחירה מופעלת.</w:t>
+      </w:r>
+    </w:p>
+    <w:p>
+      <w:pPr>
+        <w:pStyle w:val="ListBullet"/>
+        <w:bidi/>
+      </w:pPr>
+      <w:r>
+        <w:rPr>
+          <w:rtl/>
+        </w:rPr>
+        <w:t>מצב כוונון ההיפר-פרמטרים.</w:t>
+      </w:r>
+    </w:p>
+    <w:p>
+      <w:pPr>
+        <w:pStyle w:val="ListBullet"/>
+        <w:bidi/>
+      </w:pPr>
+      <w:r>
+        <w:rPr>
+          <w:rtl/>
+        </w:rPr>
+        <w:t>קובץ הפיצ'רים או תיקיית הספקטרוגרמות המתאימים.</w:t>
+      </w:r>
+    </w:p>
+    <w:p>
+      <w:pPr>
+        <w:pStyle w:val="ListBullet"/>
+        <w:bidi/>
+      </w:pPr>
+      <w:r>
+        <w:rPr>
+          <w:rtl/>
+        </w:rPr>
+        <w:t>ה-Dataset המתאים במחברת Kaggle.</w:t>
+      </w:r>
+    </w:p>
+    <w:p>
+      <w:pPr>
+        <w:bidi/>
+        <w:rPr>
+          <w:rFonts w:hint="cs"/>
+          <w:rtl/>
+          <w:lang w:bidi="he-IL"/>
+        </w:rPr>
+      </w:pPr>
+      <w:r>
+        <w:rPr>
+          <w:rtl/>
+        </w:rPr>
+        <w:t>במודלים שבהם קיימת אקראיות ייתכנו הבדלים קטנים בין הרצות.</w:t>
+      </w:r>
+    </w:p>
+    <w:p>
+      <w:pPr>
+        <w:pStyle w:val="Heading2"/>
+        <w:bidi/>
+        <w:rPr>
+          <w:rFonts w:ascii="Arial" w:hAnsi="Arial"/>
+          <w:rtl/>
+          <w:lang w:bidi="he-IL"/>
+        </w:rPr>
+      </w:pPr>
+      <w:r>
+        <w:rPr>
+          <w:rFonts w:ascii="Arial" w:hAnsi="Arial" w:hint="cs"/>
+          <w:rtl/>
+          <w:lang w:bidi="he-IL"/>
+        </w:rPr>
+        <w:t>9</w:t>
+      </w:r>
+      <w:r>
+        <w:rPr>
+          <w:rFonts w:ascii="Arial" w:hAnsi="Arial"/>
+          <w:rtl/>
+        </w:rPr>
+        <w:t xml:space="preserve">. </w:t>
+      </w:r>
+      <w:r>
+        <w:rPr>
+          <w:rFonts w:ascii="Arial" w:hAnsi="Arial" w:hint="cs"/>
+          <w:rtl/>
+          <w:lang w:bidi="he-IL"/>
+        </w:rPr>
+        <w:t xml:space="preserve">הקלטים למחברות </w:t>
+      </w:r>
+      <w:r>
+        <w:rPr>
+          <w:rFonts w:ascii="Arial" w:hAnsi="Arial"/>
+          <w:lang w:bidi="he-IL"/>
+        </w:rPr>
+        <w:t>kaggle</w:t>
+      </w:r>
+      <w:r>
+        <w:rPr>
+          <w:rFonts w:ascii="Arial" w:hAnsi="Arial" w:hint="cs"/>
+          <w:rtl/>
+          <w:lang w:bidi="he-IL"/>
+        </w:rPr>
+        <w:t xml:space="preserve"> </w:t>
+      </w:r>
+      <w:r>
+        <w:rPr>
+          <w:rFonts w:ascii="Arial" w:hAnsi="Arial"/>
+          <w:rtl/>
+          <w:lang w:bidi="he-IL"/>
+        </w:rPr>
+        <w:tab/>
+      </w:r>
+    </w:p>
+    <w:p>
+      <w:pPr>
+        <w:pStyle w:val="Heading2"/>
+        <w:bidi/>
+        <w:rPr>
+          <w:rFonts w:ascii="Arial" w:hAnsi="Arial"/>
+          <w:lang w:bidi="he-IL"/>
+        </w:rPr>
+      </w:pPr>
+      <w:r>
+        <w:rPr>
+          <w:rFonts w:cs="Arial"/>
+          <w:noProof/>
+          <w:rtl/>
+          <w:lang w:bidi="he-IL"/>
+        </w:rPr>
+        <w:drawing>
+          <wp:anchor distT="0" distB="0" distL="114300" distR="114300" simplePos="0" relativeHeight="251659264" behindDoc="1" locked="0" layoutInCell="1" allowOverlap="1" wp14:anchorId="7D01F60B" wp14:editId="24189B32">
+            <wp:simplePos x="0" y="0"/>
+            <wp:positionH relativeFrom="column">
+              <wp:posOffset>-243840</wp:posOffset>
+            </wp:positionH>
+            <wp:positionV relativeFrom="paragraph">
+              <wp:posOffset>254000</wp:posOffset>
+            </wp:positionV>
+            <wp:extent cx="4794496" cy="3568883"/>
+            <wp:effectExtent l="0" t="0" r="6350" b="0"/>
+            <wp:wrapNone/>
+            <wp:docPr id="694299529" name="Picture 1"/>
+            <wp:cNvGraphicFramePr>
+              <a:graphicFrameLocks xmlns:a="http://schemas.openxmlformats.org/drawingml/2006/main" noChangeAspect="1"/>
+            </wp:cNvGraphicFramePr>
+            <a:graphic xmlns:a="http://schemas.openxmlformats.org/drawingml/2006/main">
+              <a:graphicData uri="http://schemas.openxmlformats.org/drawingml/2006/picture">
+                <pic:pic xmlns:pic="http://schemas.openxmlformats.org/drawingml/2006/picture">
+                  <pic:nvPicPr>
+                    <pic:cNvPr id="694299529" name=""/>
+                    <pic:cNvPicPr/>
+                  </pic:nvPicPr>
+                  <pic:blipFill>
+                    <a:blip r:embed="rId8"/>
+                    <a:stretch>
+                      <a:fillRect/>
+                    </a:stretch>
+                  </pic:blipFill>
+                  <pic:spPr>
+                    <a:xfrm>
+                      <a:off x="0" y="0"/>
+                      <a:ext cx="4794496" cy="3568883"/>
+                    </a:xfrm>
+                    <a:prstGeom prst="rect">
+                      <a:avLst/>
+                    </a:prstGeom>
+                  </pic:spPr>
+                </pic:pic>
+              </a:graphicData>
+            </a:graphic>
+          </wp:anchor>
+        </w:drawing>
+      </w:r>
+      <w:r>
+        <w:rPr>
+          <w:rFonts w:ascii="Arial" w:hAnsi="Arial"/>
+          <w:rtl/>
+          <w:lang w:bidi="he-IL"/>
+        </w:rPr>
+        <w:tab/>
+      </w:r>
+      <w:r>
+        <w:rPr>
+          <w:rFonts w:ascii="Arial" w:hAnsi="Arial" w:hint="cs"/>
+          <w:rtl/>
+          <w:lang w:bidi="he-IL"/>
+        </w:rPr>
+        <w:t>9</w:t>
+      </w:r>
+      <w:r>
+        <w:rPr>
+          <w:rFonts w:ascii="Arial" w:hAnsi="Arial" w:hint="cs"/>
+          <w:rtl/>
+          <w:lang w:bidi="he-IL"/>
+        </w:rPr>
+        <w:t xml:space="preserve">.1 </w:t>
+      </w:r>
+      <w:r>
+        <w:rPr>
+          <w:rFonts w:ascii="Arial" w:hAnsi="Arial"/>
+          <w:rtl/>
+        </w:rPr>
+        <w:t xml:space="preserve"> </w:t>
+      </w:r>
+      <w:r>
+        <w:rPr>
+          <w:rFonts w:ascii="Arial" w:hAnsi="Arial" w:hint="cs"/>
+          <w:rtl/>
+          <w:lang w:bidi="he-IL"/>
+        </w:rPr>
+        <w:t xml:space="preserve">מחברת </w:t>
+      </w:r>
+      <w:r>
+        <w:rPr>
+          <w:rFonts w:ascii="Arial" w:hAnsi="Arial"/>
+          <w:lang w:bidi="he-IL"/>
+        </w:rPr>
+        <w:t>main_machine_learning</w:t>
+      </w:r>
+    </w:p>
+    <w:p>
+      <w:pPr>
+        <w:bidi/>
+        <w:rPr>
+          <w:rtl/>
+          <w:lang w:bidi="he-IL"/>
+        </w:rPr>
+      </w:pPr>
+    </w:p>
+    <w:p>
+      <w:pPr>
+        <w:bidi/>
+        <w:rPr>
+          <w:rtl/>
+          <w:lang w:bidi="he-IL"/>
+        </w:rPr>
+      </w:pPr>
+    </w:p>
+    <w:p>
+      <w:pPr>
+        <w:bidi/>
+        <w:rPr>
+          <w:rtl/>
+          <w:lang w:bidi="he-IL"/>
+        </w:rPr>
+      </w:pPr>
+    </w:p>
+    <w:p>
+      <w:pPr>
+        <w:bidi/>
+        <w:rPr>
+          <w:rtl/>
+          <w:lang w:bidi="he-IL"/>
+        </w:rPr>
+      </w:pPr>
+    </w:p>
+    <w:p>
+      <w:pPr>
+        <w:bidi/>
+        <w:rPr>
+          <w:rtl/>
+          <w:lang w:bidi="he-IL"/>
+        </w:rPr>
+      </w:pPr>
+    </w:p>
+    <w:p>
+      <w:pPr>
+        <w:bidi/>
+        <w:rPr>
+          <w:rtl/>
+          <w:lang w:bidi="he-IL"/>
+        </w:rPr>
+      </w:pPr>
+    </w:p>
+    <w:p>
+      <w:pPr>
+        <w:bidi/>
+        <w:rPr>
+          <w:rtl/>
+          <w:lang w:bidi="he-IL"/>
+        </w:rPr>
+      </w:pPr>
+    </w:p>
+    <w:p>
+      <w:pPr>
+        <w:bidi/>
+        <w:rPr>
+          <w:rtl/>
+          <w:lang w:bidi="he-IL"/>
+        </w:rPr>
+      </w:pPr>
+    </w:p>
+    <w:p>
+      <w:pPr>
+        <w:bidi/>
+        <w:rPr>
+          <w:rtl/>
+          <w:lang w:bidi="he-IL"/>
+        </w:rPr>
+      </w:pPr>
+    </w:p>
+    <w:p>
+      <w:pPr>
+        <w:bidi/>
+        <w:rPr>
+          <w:rtl/>
+          <w:lang w:bidi="he-IL"/>
+        </w:rPr>
+      </w:pPr>
+    </w:p>
+    <w:p>
+      <w:pPr>
+        <w:bidi/>
+        <w:rPr>
+          <w:rtl/>
+          <w:lang w:bidi="he-IL"/>
+        </w:rPr>
+      </w:pPr>
+    </w:p>
+    <w:p>
+      <w:pPr>
+        <w:bidi/>
+        <w:rPr>
+          <w:rtl/>
+          <w:lang w:bidi="he-IL"/>
+        </w:rPr>
+      </w:pPr>
+    </w:p>
+    <w:p>
+      <w:pPr>
+        <w:pStyle w:val="Heading2"/>
+        <w:bidi/>
+        <w:rPr>
+          <w:rFonts w:asciiTheme="majorBidi" w:hAnsiTheme="majorBidi"/>
+          <w:lang w:bidi="he-IL"/>
+        </w:rPr>
+      </w:pPr>
+      <w:r>
+        <w:rPr>
+          <w:rtl/>
+          <w:lang w:bidi="he-IL"/>
+        </w:rPr>
+        <w:tab/>
+      </w:r>
+      <w:r>
+        <w:rPr>
+          <w:rFonts w:ascii="Arial" w:hAnsi="Arial" w:hint="cs"/>
+          <w:rtl/>
+          <w:lang w:bidi="he-IL"/>
+        </w:rPr>
+        <w:t>9</w:t>
+      </w:r>
+      <w:r>
+        <w:rPr>
+          <w:rFonts w:ascii="Arial" w:hAnsi="Arial" w:hint="cs"/>
+          <w:rtl/>
+          <w:lang w:bidi="he-IL"/>
+        </w:rPr>
+        <w:t xml:space="preserve">.2 </w:t>
+      </w:r>
+      <w:r>
+        <w:rPr>
+          <w:rFonts w:ascii="Arial" w:hAnsi="Arial"/>
+          <w:rtl/>
+        </w:rPr>
+        <w:t xml:space="preserve"> </w:t>
+      </w:r>
+      <w:r>
+        <w:rPr>
+          <w:rFonts w:asciiTheme="majorBidi" w:hAnsiTheme="majorBidi"/>
+          <w:rtl/>
+          <w:lang w:bidi="he-IL"/>
+        </w:rPr>
+        <w:t xml:space="preserve">מחברת </w:t>
+      </w:r>
+      <w:r>
+        <w:rPr>
+          <w:rFonts w:asciiTheme="majorBidi" w:hAnsiTheme="majorBidi"/>
+          <w:lang w:bidi="he-IL"/>
+        </w:rPr>
+        <w:t>main_cnn</w:t>
+      </w:r>
+      <w:r>
+        <w:rPr>
+          <w:rFonts w:asciiTheme="majorBidi" w:hAnsiTheme="majorBidi"/>
+          <w:rtl/>
+          <w:lang w:bidi="he-IL"/>
+        </w:rPr>
+        <w:t xml:space="preserve"> ו- </w:t>
+      </w:r>
+      <w:r>
+        <w:rPr>
+          <w:rFonts w:asciiTheme="majorBidi" w:hAnsiTheme="majorBidi"/>
+          <w:lang w:bidi="he-IL"/>
+        </w:rPr>
+        <w:t>main_multimodal_cnn</w:t>
+      </w:r>
+    </w:p>
+    <w:p>
+      <w:pPr>
+        <w:bidi/>
+        <w:rPr>
+          <w:rtl/>
+          <w:lang w:bidi="he-IL"/>
+        </w:rPr>
+      </w:pPr>
+      <w:r>
+        <w:rPr>
+          <w:rFonts w:cs="Arial"/>
+          <w:noProof/>
+          <w:rtl/>
+          <w:lang w:bidi="he-IL"/>
+        </w:rPr>
+        <w:drawing>
+          <wp:anchor distT="0" distB="0" distL="114300" distR="114300" simplePos="0" relativeHeight="251661312" behindDoc="1" locked="0" layoutInCell="1" allowOverlap="1" wp14:anchorId="684FFB1F" wp14:editId="6E2A6AC6">
+            <wp:simplePos x="0" y="0"/>
+            <wp:positionH relativeFrom="column">
+              <wp:posOffset>635</wp:posOffset>
+            </wp:positionH>
+            <wp:positionV relativeFrom="paragraph">
+              <wp:posOffset>6985</wp:posOffset>
+            </wp:positionV>
+            <wp:extent cx="2778034" cy="1341120"/>
+            <wp:effectExtent l="0" t="0" r="3810" b="0"/>
+            <wp:wrapNone/>
+            <wp:docPr id="1446498507" name="Picture 1"/>
+            <wp:cNvGraphicFramePr>
+              <a:graphicFrameLocks xmlns:a="http://schemas.openxmlformats.org/drawingml/2006/main" noChangeAspect="1"/>
+            </wp:cNvGraphicFramePr>
+            <a:graphic xmlns:a="http://schemas.openxmlformats.org/drawingml/2006/main">
+              <a:graphicData uri="http://schemas.openxmlformats.org/drawingml/2006/picture">
+                <pic:pic xmlns:pic="http://schemas.openxmlformats.org/drawingml/2006/picture">
+                  <pic:nvPicPr>
+                    <pic:cNvPr id="1446498507" name=""/>
+                    <pic:cNvPicPr/>
+                  </pic:nvPicPr>
+                  <pic:blipFill>
+                    <a:blip r:embed="rId9"/>
+                    <a:stretch>
+                      <a:fillRect/>
+                    </a:stretch>
+                  </pic:blipFill>
+                  <pic:spPr>
+                    <a:xfrm>
+                      <a:off x="0" y="0"/>
+                      <a:ext cx="2779376" cy="1341768"/>
+                    </a:xfrm>
+                    <a:prstGeom prst="rect">
+                      <a:avLst/>
+                    </a:prstGeom>
+                  </pic:spPr>
+                </pic:pic>
+              </a:graphicData>
+            </a:graphic>
+            <wp14:sizeRelH relativeFrom="margin">
+              <wp14:pctWidth>0</wp14:pctWidth>
+            </wp14:sizeRelH>
+            <wp14:sizeRelV relativeFrom="margin">
+              <wp14:pctHeight>0</wp14:pctHeight>
+            </wp14:sizeRelV>
+          </wp:anchor>
+        </w:drawing>
+      </w:r>
+      <w:r>
+        <w:rPr>
+          <w:rtl/>
+          <w:lang w:bidi="he-IL"/>
+        </w:rPr>
+        <w:tab/>
+      </w:r>
+      <w:r>
+        <w:rPr>
+          <w:rtl/>
+          <w:lang w:bidi="he-IL"/>
+        </w:rPr>
+        <w:tab/>
+      </w:r>
+    </w:p>
+    <w:p>
+      <w:pPr>
+        <w:tabs>
+          <w:tab w:val="left" w:pos="1214"/>
+        </w:tabs>
+        <w:bidi/>
+        <w:rPr>
+          <w:rtl/>
+          <w:lang w:bidi="he-IL"/>
+        </w:rPr>
+      </w:pPr>
+    </w:p>
+    <w:p>
+      <w:pPr>
+        <w:tabs>
+          <w:tab w:val="left" w:pos="1214"/>
+        </w:tabs>
+        <w:bidi/>
+        <w:rPr>
+          <w:rtl/>
+          <w:lang w:bidi="he-IL"/>
+        </w:rPr>
+      </w:pPr>
+    </w:p>
+    <w:p>
+      <w:pPr>
+        <w:tabs>
+          <w:tab w:val="left" w:pos="1214"/>
+        </w:tabs>
+        <w:bidi/>
+        <w:rPr>
+          <w:rtl/>
+          <w:lang w:bidi="he-IL"/>
+        </w:rPr>
+      </w:pPr>
+    </w:p>
+    <w:p>
+      <w:pPr>
+        <w:tabs>
+          <w:tab w:val="left" w:pos="1214"/>
+        </w:tabs>
+        <w:bidi/>
+        <w:rPr>
+          <w:rtl/>
+          <w:lang w:bidi="he-IL"/>
+        </w:rPr>
+      </w:pPr>
+    </w:p>
+    <w:p>
+      <w:pPr>
+        <w:pStyle w:val="Heading2"/>
+        <w:bidi/>
+        <w:rPr>
+          <w:rFonts w:asciiTheme="majorBidi" w:hAnsiTheme="majorBidi"/>
+          <w:rtl/>
+          <w:lang w:bidi="he-IL"/>
+        </w:rPr>
+      </w:pPr>
+      <w:r>
+        <w:rPr>
+          <w:rtl/>
+          <w:lang w:bidi="he-IL"/>
+        </w:rPr>
+        <w:tab/>
+      </w:r>
+      <w:r>
+        <w:rPr>
+          <w:rFonts w:ascii="Arial" w:hAnsi="Arial" w:hint="cs"/>
+          <w:rtl/>
+          <w:lang w:bidi="he-IL"/>
+        </w:rPr>
+        <w:t>9</w:t>
+      </w:r>
+      <w:r>
+        <w:rPr>
+          <w:rFonts w:ascii="Arial" w:hAnsi="Arial" w:hint="cs"/>
+          <w:rtl/>
+          <w:lang w:bidi="he-IL"/>
+        </w:rPr>
+        <w:t xml:space="preserve">.3 </w:t>
+      </w:r>
+      <w:r>
+        <w:rPr>
+          <w:rFonts w:ascii="Arial" w:hAnsi="Arial"/>
+          <w:rtl/>
+        </w:rPr>
+        <w:t xml:space="preserve"> </w:t>
+      </w:r>
+      <w:r>
+        <w:rPr>
+          <w:rFonts w:ascii="Arial" w:hAnsi="Arial" w:hint="cs"/>
+          <w:rtl/>
+          <w:lang w:bidi="he-IL"/>
+        </w:rPr>
+        <w:t>מחבר</w:t>
+      </w:r>
+      <w:r>
+        <w:rPr>
+          <w:rFonts w:asciiTheme="majorBidi" w:hAnsiTheme="majorBidi"/>
+          <w:rtl/>
+          <w:lang w:bidi="he-IL"/>
+        </w:rPr>
+        <w:t xml:space="preserve">ת </w:t>
+      </w:r>
+      <w:r>
+        <w:rPr>
+          <w:rFonts w:asciiTheme="majorBidi" w:hAnsiTheme="majorBidi"/>
+          <w:lang w:bidi="he-IL"/>
+        </w:rPr>
+        <w:t>archive_cnn</w:t>
+      </w:r>
+    </w:p>
+    <w:p>
+      <w:pPr>
+        <w:tabs>
+          <w:tab w:val="left" w:pos="1214"/>
+        </w:tabs>
+        <w:bidi/>
+        <w:rPr>
+          <w:rtl/>
+          <w:lang w:bidi="he-IL"/>
+        </w:rPr>
+      </w:pPr>
+      <w:r>
+        <w:rPr>
+          <w:rFonts w:cs="Arial"/>
+          <w:noProof/>
+          <w:rtl/>
+          <w:lang w:bidi="he-IL"/>
+        </w:rPr>
+        <w:drawing>
+          <wp:anchor distT="0" distB="0" distL="114300" distR="114300" simplePos="0" relativeHeight="251663360" behindDoc="1" locked="0" layoutInCell="1" allowOverlap="1" wp14:anchorId="3DEBBC44" wp14:editId="1525874A">
+            <wp:simplePos x="0" y="0"/>
+            <wp:positionH relativeFrom="column">
+              <wp:posOffset>168275</wp:posOffset>
+            </wp:positionH>
+            <wp:positionV relativeFrom="paragraph">
+              <wp:posOffset>210185</wp:posOffset>
+            </wp:positionV>
+            <wp:extent cx="2133936" cy="1059180"/>
+            <wp:effectExtent l="0" t="0" r="0" b="7620"/>
+            <wp:wrapNone/>
+            <wp:docPr id="685102088" name="Picture 1"/>
+            <wp:cNvGraphicFramePr>
+              <a:graphicFrameLocks xmlns:a="http://schemas.openxmlformats.org/drawingml/2006/main" noChangeAspect="1"/>
+            </wp:cNvGraphicFramePr>
+            <a:graphic xmlns:a="http://schemas.openxmlformats.org/drawingml/2006/main">
+              <a:graphicData uri="http://schemas.openxmlformats.org/drawingml/2006/picture">
+                <pic:pic xmlns:pic="http://schemas.openxmlformats.org/drawingml/2006/picture">
+                  <pic:nvPicPr>
+                    <pic:cNvPr id="685102088" name=""/>
+                    <pic:cNvPicPr/>
+                  </pic:nvPicPr>
+                  <pic:blipFill>
+                    <a:blip r:embed="rId10"/>
+                    <a:stretch>
+                      <a:fillRect/>
+                    </a:stretch>
+                  </pic:blipFill>
+                  <pic:spPr>
+                    <a:xfrm>
+                      <a:off x="0" y="0"/>
+                      <a:ext cx="2133936" cy="1059180"/>
+                    </a:xfrm>
+                    <a:prstGeom prst="rect">
+                      <a:avLst/>
+                    </a:prstGeom>
+                  </pic:spPr>
+                </pic:pic>
+              </a:graphicData>
+            </a:graphic>
+            <wp14:sizeRelH relativeFrom="margin">
+              <wp14:pctWidth>0</wp14:pctWidth>
+            </wp14:sizeRelH>
+            <wp14:sizeRelV relativeFrom="margin">
+              <wp14:pctHeight>0</wp14:pctHeight>
+            </wp14:sizeRelV>
+          </wp:anchor>
+        </w:drawing>
+      </w:r>
+    </w:p>
+    <w:p>
+      <w:pPr>
+        <w:bidi/>
+        <w:rPr>
+          <w:rtl/>
+          <w:lang w:bidi="he-IL"/>
+        </w:rPr>
+      </w:pPr>
+    </w:p>
+    <w:p>
+      <w:pPr>
+        <w:bidi/>
+        <w:rPr>
+          <w:rtl/>
+          <w:lang w:bidi="he-IL"/>
+        </w:rPr>
+      </w:pPr>
+    </w:p>
+    <w:p>
+      <w:pPr>
+        <w:bidi/>
+        <w:rPr>
+          <w:rtl/>
+          <w:lang w:bidi="he-IL"/>
+        </w:rPr>
+      </w:pPr>
+    </w:p>
+    <w:p>
+      <w:pPr>
+        <w:bidi/>
+        <w:rPr>
+          <w:rtl/>
+          <w:lang w:bidi="he-IL"/>
+        </w:rPr>
+      </w:pPr>
+    </w:p>
+    <w:p>
+      <w:pPr>
+        <w:pStyle w:val="Heading2"/>
+        <w:bidi/>
+        <w:rPr>
+          <w:rFonts w:ascii="Arial" w:hAnsi="Arial"/>
+          <w:u w:val="single"/>
+          <w:rtl/>
+          <w:lang w:bidi="he-IL"/>
+        </w:rPr>
+      </w:pPr>
+      <w:r>
+        <w:rPr>
+          <w:rFonts w:ascii="Arial" w:hAnsi="Arial" w:hint="cs"/>
+          <w:u w:val="single"/>
+          <w:rtl/>
+          <w:lang w:bidi="he-IL"/>
+        </w:rPr>
+        <w:t>10</w:t>
+      </w:r>
+      <w:r>
+        <w:rPr>
+          <w:rFonts w:ascii="Arial" w:hAnsi="Arial"/>
+          <w:u w:val="single"/>
+          <w:rtl/>
+        </w:rPr>
+        <w:t xml:space="preserve">. </w:t>
+      </w:r>
+      <w:r>
+        <w:rPr>
+          <w:rFonts w:ascii="Arial" w:hAnsi="Arial" w:hint="cs"/>
+          <w:u w:val="single"/>
+          <w:rtl/>
+          <w:lang w:bidi="he-IL"/>
+        </w:rPr>
+        <w:t xml:space="preserve">יצירת קובצי הקלט מחדש -מפורט </w:t>
+      </w:r>
+      <w:r>
+        <w:rPr>
+          <w:rFonts w:ascii="Arial" w:hAnsi="Arial" w:hint="cs"/>
+          <w:u w:val="single"/>
+          <w:rtl/>
+          <w:lang w:bidi="he-IL"/>
+        </w:rPr>
+        <w:t xml:space="preserve"> </w:t>
+      </w:r>
+      <w:r>
+        <w:rPr>
+          <w:rFonts w:ascii="Arial" w:hAnsi="Arial"/>
+          <w:rtl/>
+          <w:lang w:bidi="he-IL"/>
+        </w:rPr>
+        <w:tab/>
+      </w:r>
+    </w:p>
+    <w:p>
+      <w:pPr>
+        <w:bidi/>
+        <w:rPr>
+          <w:rtl/>
+          <w:lang w:bidi="he-IL"/>
+        </w:rPr>
+      </w:pPr>
+    </w:p>
+    <w:p>
+      <w:pPr>
+        <w:pStyle w:val="Heading2"/>
+        <w:bidi/>
+      </w:pPr>
+      <w:r>
+        <w:rPr>
+          <w:rFonts w:ascii="Arial" w:hAnsi="Arial" w:hint="cs"/>
+          <w:rtl/>
+          <w:lang w:bidi="he-IL"/>
+        </w:rPr>
+        <w:t>10.1</w:t>
+      </w:r>
+      <w:r>
+        <w:rPr>
+          <w:rFonts w:ascii="Arial" w:hAnsi="Arial"/>
+          <w:rtl/>
+        </w:rPr>
+        <w:t xml:space="preserve"> הכנת מאגרי הדיבור החופשי</w:t>
+      </w:r>
+    </w:p>
+    <w:p>
+      <w:pPr>
+        <w:bidi/>
+      </w:pPr>
+      <w:r>
+        <w:rPr>
+          <w:rtl/>
+        </w:rPr>
+        <w:t>הנתונים המקוריים נמצאים תחת:</w:t>
+      </w:r>
+    </w:p>
+    <w:p>
       <w:r>
         <w:rPr>
           <w:rFonts w:ascii="Courier New" w:hAnsi="Courier New"/>
           <w:sz w:val="19"/>
         </w:rPr>
-        <w:t>main_cnn</w:t>
-      </w:r>
+        <w:t>all_accents_data/</w:t>
+      </w:r>
+    </w:p>
+    <w:p>
+      <w:pPr>
+        <w:bidi/>
+      </w:pPr>
+      <w:r>
+        <w:rPr>
+          <w:rtl/>
+        </w:rPr>
+        <w:t>כדי לאחד את המקורות לפי מבטא מריצים</w:t>
+      </w:r>
+      <w:r>
+        <w:rPr>
+          <w:rFonts w:hint="cs"/>
+          <w:rtl/>
+          <w:lang w:bidi="he-IL"/>
+        </w:rPr>
+        <w:t xml:space="preserve"> את הקובץ הבא (בתיקייה הראשית)</w:t>
+      </w:r>
+      <w:r>
+        <w:rPr>
+          <w:rtl/>
+        </w:rPr>
+        <w:t>:</w:t>
+      </w:r>
+    </w:p>
+    <w:p>
       <w:r>
         <w:rPr>
           <w:rFonts w:ascii="Courier New" w:hAnsi="Courier New"/>
           <w:sz w:val="19"/>
         </w:rPr>
-        <w:t>.py</w:t>
+        <w:t>group_sources_to_one_by_accent.py</w:t>
       </w:r>
     </w:p>
     <w:p>
       <w:pPr>
         <w:bidi/>
         <w:rPr>
-          <w:rFonts w:hint="cs"/>
-          <w:rtl/>
-          <w:lang w:bidi="he-IL"/>
-        </w:rPr>
-      </w:pPr>
-      <w:r>
-        <w:rPr>
-          <w:rtl/>
-        </w:rPr>
-        <w:t>מחברת Kaggle:</w:t>
+          <w:rtl/>
+          <w:lang w:bidi="he-IL"/>
+        </w:rPr>
+      </w:pPr>
+      <w:r>
+        <w:rPr>
+          <w:rtl/>
+        </w:rPr>
+        <w:t>הפלט נשמר תחת:</w:t>
       </w:r>
     </w:p>
     <w:p>
@@ -349,104 +2293,369 @@
           <w:rFonts w:ascii="Courier New" w:hAnsi="Courier New"/>
           <w:sz w:val="19"/>
         </w:rPr>
-        <w:t>[להוסיף קישור]</w:t>
+        <w:t>audio_by_accent_raw/</w:t>
       </w:r>
     </w:p>
     <w:p>
       <w:pPr>
         <w:pStyle w:val="Heading2"/>
         <w:bidi/>
-      </w:pPr>
+        <w:rPr>
+          <w:rFonts w:asciiTheme="majorBidi" w:hAnsiTheme="majorBidi"/>
+          <w:lang w:bidi="he-IL"/>
+        </w:rPr>
+      </w:pPr>
+      <w:r>
+        <w:rPr>
+          <w:rFonts w:ascii="Arial" w:hAnsi="Arial" w:hint="cs"/>
+          <w:rtl/>
+          <w:lang w:bidi="he-IL"/>
+        </w:rPr>
+        <w:t>10.2</w:t>
+      </w:r>
       <w:r>
         <w:rPr>
           <w:rFonts w:ascii="Arial" w:hAnsi="Arial"/>
           <w:rtl/>
         </w:rPr>
-        <w:t>4. שחזור המודל המולטי-מודאלי</w:t>
+        <w:t xml:space="preserve"> </w:t>
+      </w:r>
+      <w:r>
+        <w:rPr>
+          <w:rFonts w:asciiTheme="majorBidi" w:hAnsiTheme="majorBidi"/>
+          <w:rtl/>
+        </w:rPr>
+        <w:t>חיתוך מאגר</w:t>
+      </w:r>
+      <w:r>
+        <w:rPr>
+          <w:rFonts w:asciiTheme="majorBidi" w:hAnsiTheme="majorBidi"/>
+          <w:rtl/>
+          <w:lang w:bidi="he-IL"/>
+        </w:rPr>
+        <w:t xml:space="preserve"> </w:t>
+      </w:r>
+      <w:r>
+        <w:rPr>
+          <w:rFonts w:asciiTheme="majorBidi" w:hAnsiTheme="majorBidi"/>
+          <w:lang w:bidi="he-IL"/>
+        </w:rPr>
+        <w:t>speech accent archive</w:t>
       </w:r>
     </w:p>
     <w:p>
       <w:pPr>
         <w:bidi/>
-      </w:pPr>
-      <w:r>
-        <w:rPr>
-          <w:rtl/>
-        </w:rPr>
-        <w:t>יש לוודא שקיימים גם הספקטרוגרמות וגם קובץ הפיצ'רים של אותו מצב.</w:t>
+        <w:rPr>
+          <w:rtl/>
+          <w:lang w:bidi="he-IL"/>
+        </w:rPr>
+      </w:pPr>
+      <w:r>
+        <w:rPr>
+          <w:rtl/>
+        </w:rPr>
+        <w:t xml:space="preserve">החיתוך מתבצע בעזרת </w:t>
+      </w:r>
+      <w:r>
+        <w:rPr>
+          <w:rFonts w:hint="cs"/>
+          <w:rtl/>
+          <w:lang w:bidi="he-IL"/>
+        </w:rPr>
+        <w:t>הקובץ הבא</w:t>
+      </w:r>
+      <w:r>
+        <w:rPr>
+          <w:rtl/>
+        </w:rPr>
+        <w:t xml:space="preserve"> שבתיקיית:</w:t>
       </w:r>
     </w:p>
     <w:p>
-      <w:pPr>
-        <w:bidi/>
-        <w:rPr>
-          <w:rFonts w:hint="cs"/>
-          <w:rtl/>
-          <w:lang w:bidi="he-IL"/>
-        </w:rPr>
-      </w:pPr>
-      <w:r>
-        <w:rPr>
-          <w:rtl/>
-        </w:rPr>
-        <w:t>מריצים:</w:t>
+      <w:r>
+        <w:rPr>
+          <w:rFonts w:ascii="Courier New" w:hAnsi="Courier New"/>
+          <w:sz w:val="19"/>
+        </w:rPr>
+        <w:t>cut_and_normalize/cut_archive_to_sentences.py</w:t>
       </w:r>
     </w:p>
     <w:p>
+      <w:pPr>
+        <w:bidi/>
+        <w:spacing w:after="0"/>
+        <w:rPr>
+          <w:rtl/>
+        </w:rPr>
+      </w:pPr>
+      <w:r>
+        <w:rPr>
+          <w:rtl/>
+        </w:rPr>
+        <w:t>התהליך נעזר</w:t>
+      </w:r>
+      <w:r>
+        <w:rPr>
+          <w:rFonts w:hint="cs"/>
+          <w:rtl/>
+          <w:lang w:bidi="he-IL"/>
+        </w:rPr>
+        <w:t xml:space="preserve"> בק</w:t>
+      </w:r>
+      <w:r>
+        <w:rPr>
+          <w:rFonts w:hint="cs"/>
+          <w:rtl/>
+          <w:lang w:bidi="he-IL"/>
+        </w:rPr>
+        <w:t xml:space="preserve">ובץ </w:t>
+      </w:r>
+      <w:r>
+        <w:rPr>
+          <w:rFonts w:ascii="Courier New" w:hAnsi="Courier New"/>
+          <w:sz w:val="18"/>
+        </w:rPr>
+        <w:t>audio_time_split.py</w:t>
+      </w:r>
+      <w:r>
+        <w:rPr>
+          <w:rFonts w:hint="cs"/>
+          <w:rtl/>
+          <w:lang w:bidi="he-IL"/>
+        </w:rPr>
+        <w:t xml:space="preserve"> ו- </w:t>
+      </w:r>
+      <w:r>
+        <w:rPr>
+          <w:rFonts w:ascii="Courier New" w:hAnsi="Courier New"/>
+          <w:sz w:val="18"/>
+        </w:rPr>
+        <w:t>sentences_extractor.py</w:t>
+      </w:r>
+      <w:r>
+        <w:rPr>
+          <w:rFonts w:hint="cs"/>
+          <w:rtl/>
+          <w:lang w:bidi="he-IL"/>
+        </w:rPr>
+        <w:t xml:space="preserve"> שמשתמשים בספריית </w:t>
+      </w:r>
+      <w:r>
+        <w:rPr>
+          <w:rtl/>
+        </w:rPr>
+        <w:t xml:space="preserve">Whisper כדי לחלק את ההקלטה לששת המשפטים. </w:t>
+      </w:r>
+    </w:p>
+    <w:p>
+      <w:pPr>
+        <w:bidi/>
+        <w:rPr>
+          <w:rtl/>
+          <w:lang w:bidi="he-IL"/>
+        </w:rPr>
+      </w:pPr>
+    </w:p>
+    <w:p>
+      <w:pPr>
+        <w:bidi/>
+      </w:pPr>
+      <w:r>
+        <w:rPr>
+          <w:rtl/>
+        </w:rPr>
+        <w:t>הפלט נשמר תחת:</w:t>
+      </w:r>
+    </w:p>
+    <w:p>
       <w:r>
         <w:rPr>
           <w:rFonts w:ascii="Courier New" w:hAnsi="Courier New"/>
           <w:sz w:val="19"/>
         </w:rPr>
-        <w:t xml:space="preserve">python </w:t>
-      </w:r>
+        <w:lastRenderedPageBreak/>
+        <w:t>sentences_samples/</w:t>
+      </w:r>
+    </w:p>
+    <w:p>
+      <w:pPr>
+        <w:bidi/>
+        <w:rPr>
+          <w:lang w:bidi="he-IL"/>
+        </w:rPr>
+      </w:pPr>
+      <w:r>
+        <w:rPr>
+          <w:rtl/>
+        </w:rPr>
+        <w:t>ובתוך כל מבטא קיימת תיקייה נפרדת לכל משפט.</w:t>
+      </w:r>
+    </w:p>
+    <w:p>
+      <w:pPr>
+        <w:pStyle w:val="Heading2"/>
+        <w:bidi/>
+      </w:pPr>
+      <w:r>
+        <w:rPr>
+          <w:rFonts w:ascii="Arial" w:hAnsi="Arial" w:hint="cs"/>
+          <w:rtl/>
+          <w:lang w:bidi="he-IL"/>
+        </w:rPr>
+        <w:t>10.3</w:t>
+      </w:r>
+      <w:r>
+        <w:rPr>
+          <w:rFonts w:ascii="Arial" w:hAnsi="Arial"/>
+          <w:rtl/>
+        </w:rPr>
+        <w:t>. יצירת קובצי המטא-דאטה</w:t>
+      </w:r>
+    </w:p>
+    <w:p>
+      <w:pPr>
+        <w:bidi/>
+      </w:pPr>
+      <w:r>
+        <w:rPr>
+          <w:rtl/>
+        </w:rPr>
+        <w:t>מריצים:</w:t>
+      </w:r>
+    </w:p>
+    <w:p>
       <w:r>
         <w:rPr>
           <w:rFonts w:ascii="Courier New" w:hAnsi="Courier New"/>
           <w:sz w:val="19"/>
         </w:rPr>
-        <w:t>main_m</w:t>
+        <w:t>metadata_generator.py</w:t>
+      </w:r>
+    </w:p>
+    <w:p>
+      <w:pPr>
+        <w:bidi/>
+      </w:pPr>
+      <w:r>
+        <w:rPr>
+          <w:rtl/>
+        </w:rPr>
+        <w:t>נוצרים קובצי metadata</w:t>
+      </w:r>
+      <w:r>
+        <w:rPr>
+          <w:rFonts w:hint="cs"/>
+          <w:rtl/>
+          <w:lang w:bidi="he-IL"/>
+        </w:rPr>
+        <w:t xml:space="preserve"> בשם </w:t>
       </w:r>
       <w:r>
         <w:rPr>
           <w:rFonts w:ascii="Courier New" w:hAnsi="Courier New"/>
           <w:sz w:val="19"/>
         </w:rPr>
-        <w:t>ultimodal_</w:t>
-      </w:r>
+        <w:t>massive_metadata_&lt;mode&gt;.csv</w:t>
+      </w:r>
+      <w:r>
+        <w:rPr>
+          <w:rFonts w:hint="cs"/>
+          <w:rtl/>
+          <w:lang w:bidi="he-IL"/>
+        </w:rPr>
+        <w:t xml:space="preserve"> </w:t>
+      </w:r>
+      <w:r>
+        <w:rPr>
+          <w:rtl/>
+        </w:rPr>
+        <w:t>עבור</w:t>
+      </w:r>
+      <w:r>
+        <w:rPr>
+          <w:rFonts w:hint="cs"/>
+          <w:rtl/>
+          <w:lang w:bidi="he-IL"/>
+        </w:rPr>
+        <w:t xml:space="preserve"> המאגרים</w:t>
+      </w:r>
+      <w:r>
+        <w:rPr>
+          <w:rtl/>
+        </w:rPr>
+        <w:t>:</w:t>
+      </w:r>
+    </w:p>
+    <w:p>
       <w:r>
         <w:rPr>
           <w:rFonts w:ascii="Courier New" w:hAnsi="Courier New"/>
           <w:sz w:val="19"/>
         </w:rPr>
-        <w:t>cnn</w:t>
-      </w:r>
+        <w:t>archive_only</w:t>
+      </w:r>
+    </w:p>
+    <w:p>
       <w:r>
         <w:rPr>
           <w:rFonts w:ascii="Courier New" w:hAnsi="Courier New"/>
           <w:sz w:val="19"/>
         </w:rPr>
-        <w:t>.py</w:t>
+        <w:t>free_text</w:t>
       </w:r>
     </w:p>
     <w:p>
-      <w:pPr>
-        <w:bidi/>
-      </w:pPr>
-      <w:r>
-        <w:rPr>
-          <w:rtl/>
-        </w:rPr>
-        <w:t>מחברת Kaggle:</w:t>
+      <w:r>
+        <w:rPr>
+          <w:rFonts w:ascii="Courier New" w:hAnsi="Courier New"/>
+          <w:sz w:val="19"/>
+        </w:rPr>
+        <w:t>mixed</w:t>
       </w:r>
     </w:p>
     <w:p>
+      <w:pPr>
+        <w:bidi/>
+        <w:rPr>
+          <w:lang w:bidi="he-IL"/>
+        </w:rPr>
+      </w:pPr>
+      <w:r>
+        <w:rPr>
+          <w:rFonts w:hint="cs"/>
+          <w:rtl/>
+          <w:lang w:bidi="he-IL"/>
+        </w:rPr>
+        <w:t xml:space="preserve">קובץ המטא דאטה של כל מאגר נשמר תחת תיקיית </w:t>
+      </w:r>
       <w:r>
         <w:rPr>
           <w:rFonts w:ascii="Courier New" w:hAnsi="Courier New"/>
           <w:sz w:val="19"/>
         </w:rPr>
-        <w:t>[להוסיף קישור]</w:t>
+        <w:t>machine_learning_official</w:t>
+      </w:r>
+      <w:r>
+        <w:rPr>
+          <w:lang w:bidi="he-IL"/>
+        </w:rPr>
+        <w:t xml:space="preserve"> _</w:t>
+      </w:r>
+      <w:r>
+        <w:rPr>
+          <w:rFonts w:ascii="Courier New" w:hAnsi="Courier New"/>
+          <w:sz w:val="19"/>
+        </w:rPr>
+        <w:t>_&lt;mode&gt;/</w:t>
+      </w:r>
+      <w:r>
+        <w:rPr>
+          <w:rFonts w:hint="cs"/>
+          <w:rtl/>
+          <w:lang w:bidi="he-IL"/>
+        </w:rPr>
+        <w:t xml:space="preserve"> בהתאמה.</w:t>
       </w:r>
     </w:p>
     <w:p>
@@ -456,10 +2665,18 @@
       </w:pPr>
       <w:r>
         <w:rPr>
+          <w:rFonts w:ascii="Arial" w:hAnsi="Arial" w:hint="cs"/>
+          <w:rtl/>
+          <w:lang w:bidi="he-IL"/>
+        </w:rPr>
+        <w:t>10.4</w:t>
+      </w:r>
+      <w:r>
+        <w:rPr>
           <w:rFonts w:ascii="Arial" w:hAnsi="Arial"/>
           <w:rtl/>
         </w:rPr>
-        <w:t>5. יצירת קובצי הקלט מחדש</w:t>
+        <w:t xml:space="preserve"> נרמול ויצירת פיצ'רים</w:t>
       </w:r>
     </w:p>
     <w:p>
@@ -470,129 +2687,56 @@
         <w:rPr>
           <w:rtl/>
         </w:rPr>
-        <w:t>אם רוצים להתחיל מקובצי האודיו:</w:t>
+        <w:t>למסלול הפיצ'רים מריצים תחילה:</w:t>
       </w:r>
     </w:p>
     <w:p>
-      <w:pPr>
-        <w:pStyle w:val="ListNumber"/>
-        <w:bidi/>
-      </w:pPr>
-      <w:r>
-        <w:rPr>
-          <w:rtl/>
-        </w:rPr>
-        <w:t>מאחדים את מאגרי ה-Free Text בעזרת group_sources_to_one_by_accent.py.</w:t>
+      <w:r>
+        <w:rPr>
+          <w:rFonts w:ascii="Courier New" w:hAnsi="Courier New"/>
+          <w:sz w:val="19"/>
+        </w:rPr>
+        <w:t>cut_and_normalize/normalize_all_for_2_folders.py</w:t>
       </w:r>
     </w:p>
     <w:p>
       <w:pPr>
-        <w:pStyle w:val="ListNumber"/>
         <w:bidi/>
-        <w:rPr>
-          <w:lang w:bidi="he-IL"/>
-        </w:rPr>
-      </w:pPr>
-      <w:r>
-        <w:rPr>
-          <w:rtl/>
-        </w:rPr>
-        <w:t xml:space="preserve">חותכים את Speech Accent Archive בעזרת </w:t>
-      </w:r>
-      <w:r>
-        <w:rPr>
-          <w:rFonts w:hint="cs"/>
-          <w:rtl/>
-          <w:lang w:bidi="he-IL"/>
-        </w:rPr>
-        <w:t xml:space="preserve">הקובץ </w:t>
-      </w:r>
-      <w:r>
-        <w:rPr>
-          <w:lang w:bidi="he-IL"/>
-        </w:rPr>
-        <w:t>cut_archive_to_sentences</w:t>
-      </w:r>
-      <w:r>
-        <w:rPr>
-          <w:lang w:bidi="he-IL"/>
-        </w:rPr>
-        <w:t>.py</w:t>
-      </w:r>
-      <w:r>
-        <w:rPr>
-          <w:rtl/>
-        </w:rPr>
-        <w:t xml:space="preserve"> שבתיקיית cut_and_normalize</w:t>
-      </w:r>
-      <w:r>
-        <w:rPr>
-          <w:rFonts w:hint="cs"/>
-          <w:rtl/>
-          <w:lang w:bidi="he-IL"/>
-        </w:rPr>
-        <w:t xml:space="preserve"> .</w:t>
+      </w:pPr>
+      <w:r>
+        <w:rPr>
+          <w:rtl/>
+        </w:rPr>
+        <w:t>הפלט נשמר ב:</w:t>
       </w:r>
     </w:p>
     <w:p>
-      <w:pPr>
-        <w:pStyle w:val="ListNumber"/>
-        <w:bidi/>
-      </w:pPr>
-      <w:r>
-        <w:rPr>
-          <w:rtl/>
-        </w:rPr>
-        <w:t>יוצרים metadata בעזרת metadata_generator.py.</w:t>
+      <w:r>
+        <w:rPr>
+          <w:rFonts w:ascii="Courier New" w:hAnsi="Courier New"/>
+          <w:sz w:val="19"/>
+        </w:rPr>
+        <w:t>audio_by_accent_raw_normalized/</w:t>
       </w:r>
     </w:p>
     <w:p>
-      <w:pPr>
-        <w:pStyle w:val="ListNumber"/>
-        <w:bidi/>
-        <w:rPr>
-          <w:lang w:bidi="he-IL"/>
-        </w:rPr>
-      </w:pPr>
-      <w:r>
-        <w:rPr>
-          <w:rtl/>
-        </w:rPr>
-        <w:t>מנרמלים את האודיו בעזרת normalize_all_for_2_folders.py</w:t>
-      </w:r>
-      <w:r>
-        <w:rPr>
-          <w:rFonts w:hint="cs"/>
-          <w:rtl/>
-          <w:lang w:bidi="he-IL"/>
-        </w:rPr>
-        <w:t xml:space="preserve"> </w:t>
-      </w:r>
-      <w:r>
-        <w:rPr>
-          <w:rtl/>
-        </w:rPr>
-        <w:t>שבתיקיית cut_and_normalize</w:t>
-      </w:r>
-      <w:r>
-        <w:rPr>
-          <w:rFonts w:hint="cs"/>
-          <w:rtl/>
-          <w:lang w:bidi="he-IL"/>
-        </w:rPr>
-        <w:t xml:space="preserve"> .</w:t>
+      <w:r>
+        <w:rPr>
+          <w:rFonts w:ascii="Courier New" w:hAnsi="Courier New"/>
+          <w:sz w:val="19"/>
+        </w:rPr>
+        <w:t>sentences_samples_normalized/</w:t>
       </w:r>
     </w:p>
     <w:p>
       <w:pPr>
-        <w:pStyle w:val="ListNumber"/>
         <w:bidi/>
       </w:pPr>
       <w:r>
         <w:rPr>
           <w:rtl/>
         </w:rPr>
-        <w:t xml:space="preserve">יוצרים את קובצי הפיצ'רים בעזרת </w:t>
+        <w:t xml:space="preserve">לאחר מכן מריצים את </w:t>
       </w:r>
       <w:r>
         <w:rPr>
@@ -600,60 +2744,51 @@
           <w:rtl/>
           <w:lang w:bidi="he-IL"/>
         </w:rPr>
-        <w:t xml:space="preserve">הקובץ </w:t>
-      </w:r>
-      <w:r>
-        <w:rPr>
-          <w:lang w:bidi="he-IL"/>
-        </w:rPr>
-        <w:t>extract_features.py</w:t>
+        <w:t>הקוד הבא ליצירת פיצ'רים לכל קובץ מטא דאטה</w:t>
+      </w:r>
+      <w:r>
+        <w:rPr>
+          <w:rtl/>
+        </w:rPr>
+        <w:t>:</w:t>
       </w:r>
     </w:p>
     <w:p>
-      <w:pPr>
-        <w:pStyle w:val="ListNumber"/>
-        <w:bidi/>
-      </w:pPr>
-      <w:r>
-        <w:rPr>
-          <w:rtl/>
-        </w:rPr>
-        <w:t>יוצרים את הספקטרוגרמות בעזרת spectogram_creation.py.</w:t>
+      <w:r>
+        <w:rPr>
+          <w:rFonts w:ascii="Courier New" w:hAnsi="Courier New"/>
+          <w:sz w:val="19"/>
+        </w:rPr>
+        <w:t>create_features.py</w:t>
       </w:r>
     </w:p>
     <w:p>
       <w:pPr>
-        <w:pStyle w:val="Heading2"/>
         <w:bidi/>
       </w:pPr>
       <w:r>
         <w:rPr>
-          <w:rFonts w:ascii="Arial" w:hAnsi="Arial"/>
-          <w:rtl/>
-        </w:rPr>
-        <w:t>6. גרפים ותוצאות</w:t>
+          <w:rtl/>
+        </w:rPr>
+        <w:t>נוצרים:</w:t>
       </w:r>
     </w:p>
     <w:p>
-      <w:pPr>
-        <w:bidi/>
-      </w:pPr>
-      <w:r>
-        <w:rPr>
-          <w:rtl/>
-        </w:rPr>
-        <w:t>חלק מהגרפים נוצרים כחלק מהרצת הניסוי.</w:t>
+      <w:r>
+        <w:rPr>
+          <w:rFonts w:ascii="Courier New" w:hAnsi="Courier New"/>
+          <w:sz w:val="19"/>
+        </w:rPr>
+        <w:t>master_extracted_features_archive_only.csv</w:t>
       </w:r>
     </w:p>
     <w:p>
-      <w:pPr>
-        <w:bidi/>
-      </w:pPr>
-      <w:r>
-        <w:rPr>
-          <w:rtl/>
-        </w:rPr>
-        <w:t>ב-Kaggle הגרפים מוצגים בפלט של תאי המחברת. בהרצה מקומית דרך PyCharm הם נשמרים גם בתיקייה:</w:t>
+      <w:r>
+        <w:rPr>
+          <w:rFonts w:ascii="Courier New" w:hAnsi="Courier New"/>
+          <w:sz w:val="19"/>
+        </w:rPr>
+        <w:t>master_extracted_features_free_text.csv</w:t>
       </w:r>
     </w:p>
     <w:p>
@@ -662,160 +2797,79 @@
           <w:rFonts w:ascii="Courier New" w:hAnsi="Courier New"/>
           <w:sz w:val="19"/>
         </w:rPr>
-        <w:t>graphs/</w:t>
+        <w:t>master_extracted_features_mixed.csv</w:t>
       </w:r>
     </w:p>
     <w:p>
       <w:pPr>
         <w:bidi/>
-      </w:pPr>
-      <w:r>
-        <w:rPr>
-          <w:rtl/>
-        </w:rPr>
-        <w:t>לכן בשחזור דרך Kaggle יש לבדוק את פלט התאים, ובהרצה מקומית יש לבדוק גם את תיקיית הגרפים.</w:t>
-      </w:r>
-    </w:p>
-    <w:p>
-      <w:pPr>
-        <w:bidi/>
-      </w:pPr>
-      <w:r>
-        <w:rPr>
-          <w:rtl/>
-        </w:rPr>
-        <w:t xml:space="preserve">תוצאות נוספות </w:t>
-      </w:r>
-      <w:r>
         <w:rPr>
           <w:rFonts w:hint="cs"/>
           <w:rtl/>
           <w:lang w:bidi="he-IL"/>
         </w:rPr>
-        <w:t>ששימשו לצורך בדיקות המאגרים ואיכות הפיצול לקבוצות נמצאות תחת תיקיית התוצאות</w:t>
-      </w:r>
-      <w:r>
-        <w:rPr>
-          <w:rtl/>
-        </w:rPr>
-        <w:t>:</w:t>
-      </w:r>
-    </w:p>
-    <w:p>
-      <w:r>
-        <w:rPr>
-          <w:rFonts w:ascii="Courier New" w:hAnsi="Courier New"/>
-          <w:sz w:val="19"/>
-        </w:rPr>
-        <w:t>results/</w:t>
-      </w:r>
-    </w:p>
-    <w:p>
-      <w:pPr>
-        <w:pStyle w:val="Heading2"/>
-        <w:bidi/>
-      </w:pPr>
-      <w:r>
-        <w:rPr>
-          <w:rFonts w:ascii="Arial" w:hAnsi="Arial"/>
-          <w:rtl/>
-        </w:rPr>
-        <w:t>7. בדיקות לפני השוואה לדו"ח</w:t>
-      </w:r>
-    </w:p>
-    <w:p>
-      <w:pPr>
-        <w:bidi/>
-      </w:pPr>
-      <w:r>
-        <w:rPr>
-          <w:rtl/>
-        </w:rPr>
-        <w:t>לפני ההרצה יש לוודא שמשתמשים באותו מצב נתונים ובאותן הגדרות של הניסוי המקורי, ובפרט:</w:t>
-      </w:r>
-    </w:p>
-    <w:p>
-      <w:pPr>
-        <w:pStyle w:val="ListBullet"/>
-        <w:bidi/>
-      </w:pPr>
-      <w:r>
-        <w:rPr>
-          <w:rtl/>
-        </w:rPr>
-        <w:t>מצב הנתונים.</w:t>
-      </w:r>
-    </w:p>
-    <w:p>
-      <w:pPr>
-        <w:pStyle w:val="ListBullet"/>
-        <w:bidi/>
-      </w:pPr>
-      <w:r>
-        <w:rPr>
-          <w:rtl/>
-        </w:rPr>
-        <w:t>הפעלת או ביטול Feature Selection.</w:t>
-      </w:r>
-    </w:p>
-    <w:p>
-      <w:pPr>
-        <w:pStyle w:val="ListBullet"/>
-        <w:bidi/>
-      </w:pPr>
-      <w:r>
-        <w:rPr>
-          <w:rtl/>
-        </w:rPr>
-        <w:t>מספר הפיצ'רים כאשר הבחירה מופעלת.</w:t>
-      </w:r>
-    </w:p>
-    <w:p>
-      <w:pPr>
-        <w:pStyle w:val="ListBullet"/>
-        <w:bidi/>
-      </w:pPr>
-      <w:r>
-        <w:rPr>
-          <w:rtl/>
-        </w:rPr>
-        <w:t>מצב כוונון ההיפר-פרמטרים.</w:t>
-      </w:r>
-    </w:p>
-    <w:p>
-      <w:pPr>
-        <w:pStyle w:val="ListBullet"/>
-        <w:bidi/>
-      </w:pPr>
-      <w:r>
-        <w:rPr>
-          <w:rtl/>
-        </w:rPr>
-        <w:t>קובץ הפיצ'רים או תיקיית הספקטרוגרמות המתאימים.</w:t>
-      </w:r>
-    </w:p>
-    <w:p>
-      <w:pPr>
-        <w:pStyle w:val="ListBullet"/>
-        <w:bidi/>
-      </w:pPr>
-      <w:r>
-        <w:rPr>
-          <w:rtl/>
-        </w:rPr>
-        <w:t>ה-Dataset המתאים במחברת Kaggle.</w:t>
-      </w:r>
-    </w:p>
-    <w:p>
-      <w:pPr>
-        <w:bidi/>
-      </w:pPr>
-      <w:r>
-        <w:rPr>
-          <w:rtl/>
-        </w:rPr>
-        <w:lastRenderedPageBreak/>
-        <w:t>במודלים שבהם קיימת אקראיות ייתכנו הבדלים קטנים בין הרצות.</w:t>
+      </w:pPr>
+      <w:r>
+        <w:rPr>
+          <w:rFonts w:hint="cs"/>
+          <w:rtl/>
+          <w:lang w:bidi="he-IL"/>
+        </w:rPr>
+        <w:t xml:space="preserve">לאחר ביצוע כל השלבים בסעיף </w:t>
+      </w:r>
+      <w:r>
+        <w:rPr>
+          <w:rFonts w:hint="cs"/>
+          <w:rtl/>
+          <w:lang w:bidi="he-IL"/>
+        </w:rPr>
+        <w:t>10</w:t>
+      </w:r>
+      <w:r>
+        <w:rPr>
+          <w:rFonts w:hint="cs"/>
+          <w:rtl/>
+          <w:lang w:bidi="he-IL"/>
+        </w:rPr>
+        <w:t xml:space="preserve"> ניתן </w:t>
+      </w:r>
+      <w:r>
+        <w:rPr>
+          <w:rFonts w:hint="cs"/>
+          <w:rtl/>
+          <w:lang w:bidi="he-IL"/>
+        </w:rPr>
+        <w:t xml:space="preserve">לחזור לשלבים 1-5 כדי </w:t>
+      </w:r>
+      <w:r>
+        <w:rPr>
+          <w:rFonts w:hint="cs"/>
+          <w:rtl/>
+          <w:lang w:bidi="he-IL"/>
+        </w:rPr>
+        <w:t xml:space="preserve">להריץ את קבצי ה </w:t>
+      </w:r>
+      <w:r>
+        <w:rPr>
+          <w:lang w:bidi="he-IL"/>
+        </w:rPr>
+        <w:t>main</w:t>
+      </w:r>
+      <w:r>
+        <w:rPr>
+          <w:rFonts w:hint="cs"/>
+          <w:rtl/>
+          <w:lang w:bidi="he-IL"/>
+        </w:rPr>
+        <w:t xml:space="preserve">  </w:t>
+      </w:r>
+      <w:r>
+        <w:rPr>
+          <w:rFonts w:hint="cs"/>
+          <w:rtl/>
+          <w:lang w:bidi="he-IL"/>
+        </w:rPr>
+        <w:t>.</w:t>
       </w:r>
     </w:p>
     <w:sectPr>
@@ -826,6 +2880,56 @@
     </w:sectPr>
   </w:body>
 </w:document>
+</file>
+
+<file path=word/endnotes.xml><?xml version="1.0" encoding="utf-8"?>
+<w:endnotes xmlns:wpc="http://schemas.microsoft.com/office/word/2010/wordprocessingCanvas" xmlns:cx="http://schemas.microsoft.com/office/drawing/2014/chartex" xmlns:cx1="http://schemas.microsoft.com/office/drawing/2015/9/8/chartex" xmlns:cx2="http://schemas.microsoft.com/office/drawing/2015/10/21/chartex" xmlns:cx3="http://schemas.microsoft.com/office/drawing/2016/5/9/chartex" xmlns:cx4="http://schemas.microsoft.com/office/drawing/2016/5/10/chartex" xmlns:cx5="http://schemas.microsoft.com/office/drawing/2016/5/11/chartex" xmlns:cx6="http://schemas.microsoft.com/office/drawing/2016/5/12/chartex" xmlns:cx7="http://schemas.microsoft.com/office/drawing/2016/5/13/chartex" xmlns:cx8="http://schemas.microsoft.com/office/drawing/2016/5/14/chartex" xmlns:mc="http://schemas.openxmlformats.org/markup-compatibility/2006" xmlns:aink="http://schemas.microsoft.com/office/drawing/2016/ink" xmlns:am3d="http://schemas.microsoft.com/office/drawing/2017/model3d" xmlns:o="urn:schemas-microsoft-com:office:office" xmlns:oel="http://schemas.microsoft.com/office/2019/extlst" xmlns:r="http://schemas.openxmlformats.org/officeDocument/2006/relationships" xmlns:m="http://schemas.openxmlformats.org/officeDocument/2006/math" xmlns:v="urn:schemas-microsoft-com:vml" xmlns:wp14="http://schemas.microsoft.com/office/word/2010/wordprocessingDrawing" xmlns:wp="http://schemas.openxmlformats.org/drawingml/2006/wordprocessingDrawing" xmlns:w10="urn:schemas-microsoft-com:office:word" xmlns:w="http://schemas.openxmlformats.org/wordprocessingml/2006/main" xmlns:w14="http://schemas.microsoft.com/office/word/2010/wordml" xmlns:w15="http://schemas.microsoft.com/office/word/2012/wordml" xmlns:w16cex="http://schemas.microsoft.com/office/word/2018/wordml/cex" xmlns:w16cid="http://schemas.microsoft.com/office/word/2016/wordml/cid" xmlns:w16="http://schemas.microsoft.com/office/word/2018/wordml" xmlns:w16du="http://schemas.microsoft.com/office/word/2023/wordml/word16du" xmlns:w16sdtdh="http://schemas.microsoft.com/office/word/2020/wordml/sdtdatahash" xmlns:w16sdtfl="http://schemas.microsoft.com/office/word/2024/wordml/sdtformatlock" xmlns:w16se="http://schemas.microsoft.com/office/word/2015/wordml/symex" xmlns:wpg="http://schemas.microsoft.com/office/word/2010/wordprocessingGroup" xmlns:wpi="http://schemas.microsoft.com/office/word/2010/wordprocessingInk" xmlns:wne="http://schemas.microsoft.com/office/word/2006/wordml" xmlns:wps="http://schemas.microsoft.com/office/word/2010/wordprocessingShape" mc:Ignorable="w14 w15 w16se w16cid w16 w16cex w16sdtdh w16sdtfl w16du wp14">
+  <w:endnote w:type="separator" w:id="-1">
+    <w:p>
+      <w:pPr>
+        <w:spacing w:after="0" w:line="240" w:lineRule="auto"/>
+      </w:pPr>
+      <w:r>
+        <w:separator/>
+      </w:r>
+    </w:p>
+  </w:endnote>
+  <w:endnote w:type="continuationSeparator" w:id="0">
+    <w:p>
+      <w:pPr>
+        <w:spacing w:after="0" w:line="240" w:lineRule="auto"/>
+      </w:pPr>
+      <w:r>
+        <w:continuationSeparator/>
+      </w:r>
+    </w:p>
+  </w:endnote>
+</w:endnotes>
+</file>
+
+<file path=word/footnotes.xml><?xml version="1.0" encoding="utf-8"?>
+<w:footnotes xmlns:wpc="http://schemas.microsoft.com/office/word/2010/wordprocessingCanvas" xmlns:cx="http://schemas.microsoft.com/office/drawing/2014/chartex" xmlns:cx1="http://schemas.microsoft.com/office/drawing/2015/9/8/chartex" xmlns:cx2="http://schemas.microsoft.com/office/drawing/2015/10/21/chartex" xmlns:cx3="http://schemas.microsoft.com/office/drawing/2016/5/9/chartex" xmlns:cx4="http://schemas.microsoft.com/office/drawing/2016/5/10/chartex" xmlns:cx5="http://schemas.microsoft.com/office/drawing/2016/5/11/chartex" xmlns:cx6="http://schemas.microsoft.com/office/drawing/2016/5/12/chartex" xmlns:cx7="http://schemas.microsoft.com/office/drawing/2016/5/13/chartex" xmlns:cx8="http://schemas.microsoft.com/office/drawing/2016/5/14/chartex" xmlns:mc="http://schemas.openxmlformats.org/markup-compatibility/2006" xmlns:aink="http://schemas.microsoft.com/office/drawing/2016/ink" xmlns:am3d="http://schemas.microsoft.com/office/drawing/2017/model3d" xmlns:o="urn:schemas-microsoft-com:office:office" xmlns:oel="http://schemas.microsoft.com/office/2019/extlst" xmlns:r="http://schemas.openxmlformats.org/officeDocument/2006/relationships" xmlns:m="http://schemas.openxmlformats.org/officeDocument/2006/math" xmlns:v="urn:schemas-microsoft-com:vml" xmlns:wp14="http://schemas.microsoft.com/office/word/2010/wordprocessingDrawing" xmlns:wp="http://schemas.openxmlformats.org/drawingml/2006/wordprocessingDrawing" xmlns:w10="urn:schemas-microsoft-com:office:word" xmlns:w="http://schemas.openxmlformats.org/wordprocessingml/2006/main" xmlns:w14="http://schemas.microsoft.com/office/word/2010/wordml" xmlns:w15="http://schemas.microsoft.com/office/word/2012/wordml" xmlns:w16cex="http://schemas.microsoft.com/office/word/2018/wordml/cex" xmlns:w16cid="http://schemas.microsoft.com/office/word/2016/wordml/cid" xmlns:w16="http://schemas.microsoft.com/office/word/2018/wordml" xmlns:w16du="http://schemas.microsoft.com/office/word/2023/wordml/word16du" xmlns:w16sdtdh="http://schemas.microsoft.com/office/word/2020/wordml/sdtdatahash" xmlns:w16sdtfl="http://schemas.microsoft.com/office/word/2024/wordml/sdtformatlock" xmlns:w16se="http://schemas.microsoft.com/office/word/2015/wordml/symex" xmlns:wpg="http://schemas.microsoft.com/office/word/2010/wordprocessingGroup" xmlns:wpi="http://schemas.microsoft.com/office/word/2010/wordprocessingInk" xmlns:wne="http://schemas.microsoft.com/office/word/2006/wordml" xmlns:wps="http://schemas.microsoft.com/office/word/2010/wordprocessingShape" mc:Ignorable="w14 w15 w16se w16cid w16 w16cex w16sdtdh w16sdtfl w16du wp14">
+  <w:footnote w:type="separator" w:id="-1">
+    <w:p>
+      <w:pPr>
+        <w:spacing w:after="0" w:line="240" w:lineRule="auto"/>
+      </w:pPr>
+      <w:r>
+        <w:separator/>
+      </w:r>
+    </w:p>
+  </w:footnote>
+  <w:footnote w:type="continuationSeparator" w:id="0">
+    <w:p>
+      <w:pPr>
+        <w:spacing w:after="0" w:line="240" w:lineRule="auto"/>
+      </w:pPr>
+      <w:r>
+        <w:continuationSeparator/>
+      </w:r>
+    </w:p>
+  </w:footnote>
+</w:footnotes>
 </file>
 
 <file path=word/numbering.xml><?xml version="1.0" encoding="utf-8"?>
@@ -1423,7 +3527,7 @@
   <w:style w:type="paragraph" w:default="1" w:styleId="Normal">
     <w:name w:val="Normal"/>
     <w:qFormat/>
-    <w:rsid w:val="00FC693F"/>
+    <w:rsid w:val="00FA241D"/>
     <w:rPr>
       <w:rFonts w:ascii="Arial" w:hAnsi="Arial"/>
     </w:rPr>
@@ -1640,6 +3744,7 @@
   <w:style w:type="character" w:default="1" w:styleId="DefaultParagraphFont">
     <w:name w:val="Default Paragraph Font"/>
     <w:uiPriority w:val="1"/>
+    <w:semiHidden/>
     <w:unhideWhenUsed/>
   </w:style>
   <w:style w:type="table" w:default="1" w:styleId="TableNormal">

</xml_diff>

<commit_message>
Remove old files 5
</commit_message>
<xml_diff>
--- a/documentation/EXPERIMENT_REPRODUCTION_GUIDE.docx
+++ b/documentation/EXPERIMENT_REPRODUCTION_GUIDE.docx
@@ -6,10 +6,16 @@
       <w:pPr>
         <w:pStyle w:val="Heading1"/>
         <w:bidi/>
+        <w:rPr>
+          <w:sz w:val="32"/>
+          <w:szCs w:val="32"/>
+        </w:rPr>
       </w:pPr>
       <w:r>
         <w:rPr>
           <w:rFonts w:ascii="Arial" w:hAnsi="Arial"/>
+          <w:sz w:val="32"/>
+          <w:szCs w:val="32"/>
           <w:rtl/>
         </w:rPr>
         <w:t>מדריך לבודק - שחזור הניסויים</w:t>
@@ -483,12 +489,25 @@
       </w:r>
     </w:p>
     <w:p>
-      <w:r>
-        <w:rPr>
-          <w:rFonts w:ascii="Courier New" w:hAnsi="Courier New"/>
-          <w:sz w:val="19"/>
-        </w:rPr>
-        <w:t>[להוסיף קישור]</w:t>
+      <w:pPr>
+        <w:rPr>
+          <w:lang w:bidi="he-IL"/>
+        </w:rPr>
+      </w:pPr>
+      <w:hyperlink r:id="rId8" w:history="1">
+        <w:r>
+          <w:rPr>
+            <w:rStyle w:val="Hyperlink"/>
+            <w:lang w:bidi="he-IL"/>
+          </w:rPr>
+          <w:t>https://www.kaggle.com/code/alonlev001/main-for-machine-learning</w:t>
+        </w:r>
+      </w:hyperlink>
+      <w:r>
+        <w:rPr>
+          <w:lang w:bidi="he-IL"/>
+        </w:rPr>
+        <w:br/>
       </w:r>
     </w:p>
     <w:p>
@@ -1211,113 +1230,133 @@
       </w:r>
     </w:p>
     <w:p>
+      <w:pPr>
+        <w:rPr>
+          <w:lang w:bidi="he-IL"/>
+        </w:rPr>
+      </w:pPr>
+      <w:hyperlink r:id="rId9" w:history="1">
+        <w:r>
+          <w:rPr>
+            <w:rStyle w:val="Hyperlink"/>
+            <w:lang w:bidi="he-IL"/>
+          </w:rPr>
+          <w:t>https://www.kaggle.com/code/alonlev001/ai-accent-classifier-cnn</w:t>
+        </w:r>
+      </w:hyperlink>
+      <w:r>
+        <w:rPr>
+          <w:lang w:bidi="he-IL"/>
+        </w:rPr>
+        <w:br/>
+      </w:r>
+    </w:p>
+    <w:p>
+      <w:pPr>
+        <w:pStyle w:val="Heading2"/>
+        <w:bidi/>
+      </w:pPr>
+      <w:r>
+        <w:rPr>
+          <w:rFonts w:ascii="Arial" w:hAnsi="Arial"/>
+          <w:rtl/>
+        </w:rPr>
+        <w:t xml:space="preserve">4. שחזור </w:t>
+      </w:r>
+      <w:r>
+        <w:rPr>
+          <w:rFonts w:asciiTheme="majorBidi" w:hAnsiTheme="majorBidi"/>
+          <w:lang w:bidi="he-IL"/>
+        </w:rPr>
+        <w:t>cnn</w:t>
+      </w:r>
+      <w:r>
+        <w:rPr>
+          <w:rFonts w:ascii="Arial" w:hAnsi="Arial" w:hint="cs"/>
+          <w:rtl/>
+          <w:lang w:bidi="he-IL"/>
+        </w:rPr>
+        <w:t xml:space="preserve"> גרסת </w:t>
+      </w:r>
+      <w:r>
+        <w:rPr>
+          <w:rFonts w:ascii="Arial" w:hAnsi="Arial"/>
+          <w:rtl/>
+        </w:rPr>
+        <w:t>המודל המולטי-מודאלי</w:t>
+      </w:r>
+    </w:p>
+    <w:p>
+      <w:pPr>
+        <w:bidi/>
+      </w:pPr>
+      <w:r>
+        <w:rPr>
+          <w:rtl/>
+        </w:rPr>
+        <w:t>יש לוודא שקיימים גם הספקטרוגרמות וגם קובץ הפיצ'רים של אותו מצב.</w:t>
+      </w:r>
+    </w:p>
+    <w:p>
+      <w:pPr>
+        <w:bidi/>
+        <w:rPr>
+          <w:rtl/>
+          <w:lang w:bidi="he-IL"/>
+        </w:rPr>
+      </w:pPr>
+      <w:r>
+        <w:rPr>
+          <w:rtl/>
+        </w:rPr>
+        <w:t>מריצים:</w:t>
+      </w:r>
+    </w:p>
+    <w:p>
       <w:r>
         <w:rPr>
           <w:rFonts w:ascii="Courier New" w:hAnsi="Courier New"/>
           <w:sz w:val="19"/>
         </w:rPr>
-        <w:t>[להוסיף קישור]</w:t>
+        <w:t>main_multimodal_cnn.py</w:t>
       </w:r>
     </w:p>
     <w:p>
       <w:pPr>
-        <w:pStyle w:val="Heading2"/>
         <w:bidi/>
       </w:pPr>
       <w:r>
         <w:rPr>
-          <w:rFonts w:ascii="Arial" w:hAnsi="Arial"/>
-          <w:rtl/>
-        </w:rPr>
-        <w:t xml:space="preserve">4. שחזור </w:t>
-      </w:r>
-      <w:r>
-        <w:rPr>
-          <w:rFonts w:asciiTheme="majorBidi" w:hAnsiTheme="majorBidi"/>
-          <w:lang w:bidi="he-IL"/>
-        </w:rPr>
-        <w:t>cnn</w:t>
-      </w:r>
-      <w:r>
-        <w:rPr>
-          <w:rFonts w:ascii="Arial" w:hAnsi="Arial" w:hint="cs"/>
-          <w:rtl/>
-          <w:lang w:bidi="he-IL"/>
-        </w:rPr>
-        <w:t xml:space="preserve"> גרסת </w:t>
-      </w:r>
-      <w:r>
-        <w:rPr>
-          <w:rFonts w:ascii="Arial" w:hAnsi="Arial"/>
-          <w:rtl/>
-        </w:rPr>
-        <w:t>המודל המולטי-מודאלי</w:t>
+          <w:rFonts w:hint="cs"/>
+          <w:rtl/>
+          <w:lang w:bidi="he-IL"/>
+        </w:rPr>
+        <w:t xml:space="preserve">או דרך </w:t>
+      </w:r>
+      <w:r>
+        <w:rPr>
+          <w:rtl/>
+        </w:rPr>
+        <w:t>מחברת Kaggle:</w:t>
       </w:r>
     </w:p>
     <w:p>
       <w:pPr>
-        <w:bidi/>
-      </w:pPr>
-      <w:r>
-        <w:rPr>
-          <w:rtl/>
-        </w:rPr>
-        <w:t>יש לוודא שקיימים גם הספקטרוגרמות וגם קובץ הפיצ'רים של אותו מצב.</w:t>
-      </w:r>
+        <w:rPr>
+          <w:lang w:bidi="he-IL"/>
+        </w:rPr>
+      </w:pPr>
+      <w:hyperlink r:id="rId10" w:history="1">
+        <w:r>
+          <w:rPr>
+            <w:rStyle w:val="Hyperlink"/>
+            <w:rFonts w:asciiTheme="minorBidi" w:hAnsiTheme="minorBidi"/>
+            <w:lang w:bidi="he-IL"/>
+          </w:rPr>
+          <w:t>https://www.kaggle.com/code/alonlev001/ai-accent-classifier-multimodal-cnn</w:t>
+        </w:r>
+      </w:hyperlink>
     </w:p>
-    <w:p>
-      <w:pPr>
-        <w:bidi/>
-        <w:rPr>
-          <w:rtl/>
-          <w:lang w:bidi="he-IL"/>
-        </w:rPr>
-      </w:pPr>
-      <w:r>
-        <w:rPr>
-          <w:rtl/>
-        </w:rPr>
-        <w:t>מריצים:</w:t>
-      </w:r>
-    </w:p>
-    <w:p>
-      <w:r>
-        <w:rPr>
-          <w:rFonts w:ascii="Courier New" w:hAnsi="Courier New"/>
-          <w:sz w:val="19"/>
-        </w:rPr>
-        <w:t>main_multimodal_cnn.py</w:t>
-      </w:r>
-    </w:p>
-    <w:p>
-      <w:pPr>
-        <w:bidi/>
-      </w:pPr>
-      <w:r>
-        <w:rPr>
-          <w:rFonts w:hint="cs"/>
-          <w:rtl/>
-          <w:lang w:bidi="he-IL"/>
-        </w:rPr>
-        <w:t xml:space="preserve">או דרך </w:t>
-      </w:r>
-      <w:r>
-        <w:rPr>
-          <w:rtl/>
-        </w:rPr>
-        <w:t>מחברת Kaggle:</w:t>
-      </w:r>
-    </w:p>
-    <w:p>
-      <w:r>
-        <w:rPr>
-          <w:rFonts w:ascii="Courier New" w:hAnsi="Courier New"/>
-          <w:sz w:val="19"/>
-        </w:rPr>
-        <w:t>[להוסיף קישור]</w:t>
-      </w:r>
-    </w:p>
-    <w:p/>
     <w:p>
       <w:pPr>
         <w:bidi/>
@@ -1894,13 +1933,31 @@
       </w:r>
     </w:p>
     <w:p>
-      <w:r>
-        <w:rPr>
-          <w:rFonts w:ascii="Courier New" w:hAnsi="Courier New"/>
-          <w:sz w:val="19"/>
-        </w:rPr>
-        <w:t>[להוסיף קישור]</w:t>
-      </w:r>
+      <w:pPr>
+        <w:rPr>
+          <w:lang w:bidi="he-IL"/>
+        </w:rPr>
+      </w:pPr>
+      <w:hyperlink r:id="rId11" w:history="1">
+        <w:r>
+          <w:rPr>
+            <w:rStyle w:val="Hyperlink"/>
+          </w:rPr>
+          <w:t>https://www.kaggle.com/code/alonlev001/</w:t>
+        </w:r>
+        <w:r>
+          <w:rPr>
+            <w:rStyle w:val="Hyperlink"/>
+          </w:rPr>
+          <w:t>a</w:t>
+        </w:r>
+        <w:r>
+          <w:rPr>
+            <w:rStyle w:val="Hyperlink"/>
+          </w:rPr>
+          <w:t>rchive-cnn</w:t>
+        </w:r>
+      </w:hyperlink>
     </w:p>
     <w:p>
       <w:pPr>
@@ -4338,7 +4395,7 @@
                     <pic:cNvPicPr/>
                   </pic:nvPicPr>
                   <pic:blipFill>
-                    <a:blip r:embed="rId8"/>
+                    <a:blip r:embed="rId12"/>
                     <a:stretch>
                       <a:fillRect/>
                     </a:stretch>
@@ -4622,7 +4679,7 @@
                     <pic:cNvPicPr/>
                   </pic:nvPicPr>
                   <pic:blipFill>
-                    <a:blip r:embed="rId9"/>
+                    <a:blip r:embed="rId13"/>
                     <a:stretch>
                       <a:fillRect/>
                     </a:stretch>
@@ -4858,7 +4915,7 @@
                     <pic:cNvPicPr/>
                   </pic:nvPicPr>
                   <pic:blipFill>
-                    <a:blip r:embed="rId10"/>
+                    <a:blip r:embed="rId14"/>
                     <a:stretch>
                       <a:fillRect/>
                     </a:stretch>
@@ -18840,6 +18897,41 @@
       <w:lang w:bidi="he-IL"/>
     </w:rPr>
   </w:style>
+  <w:style w:type="character" w:styleId="Hyperlink">
+    <w:name w:val="Hyperlink"/>
+    <w:basedOn w:val="DefaultParagraphFont"/>
+    <w:uiPriority w:val="99"/>
+    <w:unhideWhenUsed/>
+    <w:rsid w:val="00910E03"/>
+    <w:rPr>
+      <w:color w:val="0000FF" w:themeColor="hyperlink"/>
+      <w:u w:val="single"/>
+    </w:rPr>
+  </w:style>
+  <w:style w:type="character" w:styleId="UnresolvedMention">
+    <w:name w:val="Unresolved Mention"/>
+    <w:basedOn w:val="DefaultParagraphFont"/>
+    <w:uiPriority w:val="99"/>
+    <w:semiHidden/>
+    <w:unhideWhenUsed/>
+    <w:rsid w:val="00910E03"/>
+    <w:rPr>
+      <w:color w:val="605E5C"/>
+      <w:shd w:val="clear" w:color="auto" w:fill="E1DFDD"/>
+    </w:rPr>
+  </w:style>
+  <w:style w:type="character" w:styleId="FollowedHyperlink">
+    <w:name w:val="FollowedHyperlink"/>
+    <w:basedOn w:val="DefaultParagraphFont"/>
+    <w:uiPriority w:val="99"/>
+    <w:semiHidden/>
+    <w:unhideWhenUsed/>
+    <w:rsid w:val="001E3180"/>
+    <w:rPr>
+      <w:color w:val="800080" w:themeColor="followedHyperlink"/>
+      <w:u w:val="single"/>
+    </w:rPr>
+  </w:style>
 </w:styles>
 </file>
 

</xml_diff>